<commit_message>
Refresh technical qualification template reference
</commit_message>
<xml_diff>
--- a/docs/reference/teknik_yeterlilik_rapor_sablonu.docx
+++ b/docs/reference/teknik_yeterlilik_rapor_sablonu.docx
@@ -59,9 +59,6 @@
       </w:r>
       <w:bookmarkStart w:id="0" w:name="_Toc187186217"/>
       <w:bookmarkStart w:id="1" w:name="_Toc152091568"/>
-      <w:r>
-        <w:t>r</w:t>
-      </w:r>
     </w:p>
     <w:p>
       <w:pPr>
@@ -442,74 +439,6 @@
                               </w:rPr>
                               <w:t>KATEGORİ ADI:</w:t>
                             </w:r>
-                            <w:r>
-                              <w:rPr>
-                                <w:rFonts w:ascii="Arial Black" w:hAnsi="Arial Black" w:cs="Arial"/>
-                                <w:b/>
-                                <w:bCs/>
-                                <w:color w:val="70AD47"/>
-                                <w:spacing w:val="10"/>
-                                <w:sz w:val="32"/>
-                                <w:szCs w:val="32"/>
-                                <w14:glow w14:rad="38100">
-                                  <w14:schemeClr w14:val="accent1">
-                                    <w14:alpha w14:val="60000"/>
-                                  </w14:schemeClr>
-                                </w14:glow>
-                                <w14:textOutline w14:w="9525" w14:cap="flat" w14:cmpd="sng" w14:algn="ctr">
-                                  <w14:solidFill>
-                                    <w14:schemeClr w14:val="tx1">
-                                      <w14:lumMod w14:val="95000"/>
-                                      <w14:lumOff w14:val="5000"/>
-                                    </w14:schemeClr>
-                                  </w14:solidFill>
-                                  <w14:prstDash w14:val="solid"/>
-                                  <w14:round/>
-                                </w14:textOutline>
-                                <w14:textFill>
-                                  <w14:solidFill>
-                                    <w14:srgbClr w14:val="70AD47">
-                                      <w14:tint w14:val="1000"/>
-                                    </w14:srgbClr>
-                                  </w14:solidFill>
-                                </w14:textFill>
-                              </w:rPr>
-                              <w:t xml:space="preserve"> </w:t>
-                            </w:r>
-                            <w:r>
-                              <w:rPr>
-                                <w:rFonts w:ascii="Arial Black" w:hAnsi="Arial Black" w:cs="Arial"/>
-                                <w:b/>
-                                <w:bCs/>
-                                <w:color w:val="70AD47"/>
-                                <w:spacing w:val="10"/>
-                                <w:sz w:val="32"/>
-                                <w:szCs w:val="32"/>
-                                <w14:glow w14:rad="38100">
-                                  <w14:schemeClr w14:val="accent1">
-                                    <w14:alpha w14:val="60000"/>
-                                  </w14:schemeClr>
-                                </w14:glow>
-                                <w14:textOutline w14:w="9525" w14:cap="flat" w14:cmpd="sng" w14:algn="ctr">
-                                  <w14:solidFill>
-                                    <w14:schemeClr w14:val="tx1">
-                                      <w14:lumMod w14:val="95000"/>
-                                      <w14:lumOff w14:val="5000"/>
-                                    </w14:schemeClr>
-                                  </w14:solidFill>
-                                  <w14:prstDash w14:val="solid"/>
-                                  <w14:round/>
-                                </w14:textOutline>
-                                <w14:textFill>
-                                  <w14:solidFill>
-                                    <w14:srgbClr w14:val="70AD47">
-                                      <w14:tint w14:val="1000"/>
-                                    </w14:srgbClr>
-                                  </w14:solidFill>
-                                </w14:textFill>
-                              </w:rPr>
-                              <w:t>Sanayide Robotik Uygulamalar Yarışması</w:t>
-                            </w:r>
                           </w:p>
                           <w:p>
                             <w:pPr>
@@ -579,74 +508,6 @@
                               </w:rPr>
                               <w:t>TAKIM ADI:</w:t>
                             </w:r>
-                            <w:r>
-                              <w:rPr>
-                                <w:rFonts w:ascii="Arial Black" w:hAnsi="Arial Black" w:cs="Arial"/>
-                                <w:b/>
-                                <w:bCs/>
-                                <w:color w:val="70AD47"/>
-                                <w:spacing w:val="10"/>
-                                <w:sz w:val="32"/>
-                                <w:szCs w:val="32"/>
-                                <w14:glow w14:rad="38100">
-                                  <w14:schemeClr w14:val="accent1">
-                                    <w14:alpha w14:val="60000"/>
-                                  </w14:schemeClr>
-                                </w14:glow>
-                                <w14:textOutline w14:w="9525" w14:cap="flat" w14:cmpd="sng" w14:algn="ctr">
-                                  <w14:solidFill>
-                                    <w14:schemeClr w14:val="tx1">
-                                      <w14:lumMod w14:val="95000"/>
-                                      <w14:lumOff w14:val="5000"/>
-                                    </w14:schemeClr>
-                                  </w14:solidFill>
-                                  <w14:prstDash w14:val="solid"/>
-                                  <w14:round/>
-                                </w14:textOutline>
-                                <w14:textFill>
-                                  <w14:solidFill>
-                                    <w14:srgbClr w14:val="70AD47">
-                                      <w14:tint w14:val="1000"/>
-                                    </w14:srgbClr>
-                                  </w14:solidFill>
-                                </w14:textFill>
-                              </w:rPr>
-                              <w:t xml:space="preserve"> </w:t>
-                            </w:r>
-                            <w:r>
-                              <w:rPr>
-                                <w:rFonts w:ascii="Arial Black" w:hAnsi="Arial Black" w:cs="Arial"/>
-                                <w:b/>
-                                <w:bCs/>
-                                <w:color w:val="70AD47"/>
-                                <w:spacing w:val="10"/>
-                                <w:sz w:val="32"/>
-                                <w:szCs w:val="32"/>
-                                <w14:glow w14:rad="38100">
-                                  <w14:schemeClr w14:val="accent1">
-                                    <w14:alpha w14:val="60000"/>
-                                  </w14:schemeClr>
-                                </w14:glow>
-                                <w14:textOutline w14:w="9525" w14:cap="flat" w14:cmpd="sng" w14:algn="ctr">
-                                  <w14:solidFill>
-                                    <w14:schemeClr w14:val="tx1">
-                                      <w14:lumMod w14:val="95000"/>
-                                      <w14:lumOff w14:val="5000"/>
-                                    </w14:schemeClr>
-                                  </w14:solidFill>
-                                  <w14:prstDash w14:val="solid"/>
-                                  <w14:round/>
-                                </w14:textOutline>
-                                <w14:textFill>
-                                  <w14:solidFill>
-                                    <w14:srgbClr w14:val="70AD47">
-                                      <w14:tint w14:val="1000"/>
-                                    </w14:srgbClr>
-                                  </w14:solidFill>
-                                </w14:textFill>
-                              </w:rPr>
-                              <w:t>VOL-İ</w:t>
-                            </w:r>
                           </w:p>
                           <w:p>
                             <w:pPr>
@@ -714,109 +575,7 @@
                                   </w14:solidFill>
                                 </w14:textFill>
                               </w:rPr>
-                              <w:t>BAŞVURU ID</w:t>
-                            </w:r>
-                            <w:r>
-                              <w:rPr>
-                                <w:rFonts w:ascii="Arial Black" w:hAnsi="Arial Black" w:cs="Arial"/>
-                                <w:b/>
-                                <w:bCs/>
-                                <w:color w:val="70AD47"/>
-                                <w:spacing w:val="10"/>
-                                <w:sz w:val="32"/>
-                                <w:szCs w:val="32"/>
-                                <w14:glow w14:rad="38100">
-                                  <w14:schemeClr w14:val="accent1">
-                                    <w14:alpha w14:val="60000"/>
-                                  </w14:schemeClr>
-                                </w14:glow>
-                                <w14:textOutline w14:w="9525" w14:cap="flat" w14:cmpd="sng" w14:algn="ctr">
-                                  <w14:solidFill>
-                                    <w14:schemeClr w14:val="tx1">
-                                      <w14:lumMod w14:val="95000"/>
-                                      <w14:lumOff w14:val="5000"/>
-                                    </w14:schemeClr>
-                                  </w14:solidFill>
-                                  <w14:prstDash w14:val="solid"/>
-                                  <w14:round/>
-                                </w14:textOutline>
-                                <w14:textFill>
-                                  <w14:solidFill>
-                                    <w14:srgbClr w14:val="70AD47">
-                                      <w14:tint w14:val="1000"/>
-                                    </w14:srgbClr>
-                                  </w14:solidFill>
-                                </w14:textFill>
-                              </w:rPr>
-                              <w:t>:</w:t>
-                            </w:r>
-                            <w:r>
-                              <w:rPr>
-                                <w:rFonts w:ascii="Arial Black" w:hAnsi="Arial Black" w:cs="Arial"/>
-                                <w:b/>
-                                <w:bCs/>
-                                <w:color w:val="70AD47"/>
-                                <w:spacing w:val="10"/>
-                                <w:sz w:val="32"/>
-                                <w:szCs w:val="32"/>
-                                <w14:glow w14:rad="38100">
-                                  <w14:schemeClr w14:val="accent1">
-                                    <w14:alpha w14:val="60000"/>
-                                  </w14:schemeClr>
-                                </w14:glow>
-                                <w14:textOutline w14:w="9525" w14:cap="flat" w14:cmpd="sng" w14:algn="ctr">
-                                  <w14:solidFill>
-                                    <w14:schemeClr w14:val="tx1">
-                                      <w14:lumMod w14:val="95000"/>
-                                      <w14:lumOff w14:val="5000"/>
-                                    </w14:schemeClr>
-                                  </w14:solidFill>
-                                  <w14:prstDash w14:val="solid"/>
-                                  <w14:round/>
-                                </w14:textOutline>
-                                <w14:textFill>
-                                  <w14:solidFill>
-                                    <w14:srgbClr w14:val="70AD47">
-                                      <w14:tint w14:val="1000"/>
-                                    </w14:srgbClr>
-                                  </w14:solidFill>
-                                </w14:textFill>
-                              </w:rPr>
-                              <w:t xml:space="preserve"> </w:t>
-                            </w:r>
-                            <w:r>
-                              <w:rPr>
-                                <w:rFonts w:ascii="Arial Black" w:hAnsi="Arial Black" w:cs="Arial"/>
-                                <w:b/>
-                                <w:bCs/>
-                                <w:color w:val="70AD47"/>
-                                <w:spacing w:val="10"/>
-                                <w:sz w:val="32"/>
-                                <w:szCs w:val="32"/>
-                                <w14:glow w14:rad="38100">
-                                  <w14:schemeClr w14:val="accent1">
-                                    <w14:alpha w14:val="60000"/>
-                                  </w14:schemeClr>
-                                </w14:glow>
-                                <w14:textOutline w14:w="9525" w14:cap="flat" w14:cmpd="sng" w14:algn="ctr">
-                                  <w14:solidFill>
-                                    <w14:schemeClr w14:val="tx1">
-                                      <w14:lumMod w14:val="95000"/>
-                                      <w14:lumOff w14:val="5000"/>
-                                    </w14:schemeClr>
-                                  </w14:solidFill>
-                                  <w14:prstDash w14:val="solid"/>
-                                  <w14:round/>
-                                </w14:textOutline>
-                                <w14:textFill>
-                                  <w14:solidFill>
-                                    <w14:srgbClr w14:val="70AD47">
-                                      <w14:tint w14:val="1000"/>
-                                    </w14:srgbClr>
-                                  </w14:solidFill>
-                                </w14:textFill>
-                              </w:rPr>
-                              <w:t>5358567</w:t>
+                              <w:t>BAŞVURU ID:</w:t>
                             </w:r>
                           </w:p>
                           <w:p>
@@ -886,74 +645,6 @@
                                 </w14:textFill>
                               </w:rPr>
                               <w:t>TAKIM ID:</w:t>
-                            </w:r>
-                            <w:r>
-                              <w:rPr>
-                                <w:rFonts w:ascii="Arial Black" w:hAnsi="Arial Black" w:cs="Arial"/>
-                                <w:b/>
-                                <w:bCs/>
-                                <w:color w:val="70AD47"/>
-                                <w:spacing w:val="10"/>
-                                <w:sz w:val="32"/>
-                                <w:szCs w:val="32"/>
-                                <w14:glow w14:rad="38100">
-                                  <w14:schemeClr w14:val="accent1">
-                                    <w14:alpha w14:val="60000"/>
-                                  </w14:schemeClr>
-                                </w14:glow>
-                                <w14:textOutline w14:w="9525" w14:cap="flat" w14:cmpd="sng" w14:algn="ctr">
-                                  <w14:solidFill>
-                                    <w14:schemeClr w14:val="tx1">
-                                      <w14:lumMod w14:val="95000"/>
-                                      <w14:lumOff w14:val="5000"/>
-                                    </w14:schemeClr>
-                                  </w14:solidFill>
-                                  <w14:prstDash w14:val="solid"/>
-                                  <w14:round/>
-                                </w14:textOutline>
-                                <w14:textFill>
-                                  <w14:solidFill>
-                                    <w14:srgbClr w14:val="70AD47">
-                                      <w14:tint w14:val="1000"/>
-                                    </w14:srgbClr>
-                                  </w14:solidFill>
-                                </w14:textFill>
-                              </w:rPr>
-                              <w:t xml:space="preserve"> </w:t>
-                            </w:r>
-                            <w:r>
-                              <w:rPr>
-                                <w:rFonts w:ascii="Arial Black" w:hAnsi="Arial Black" w:cs="Arial"/>
-                                <w:b/>
-                                <w:bCs/>
-                                <w:color w:val="70AD47"/>
-                                <w:spacing w:val="10"/>
-                                <w:sz w:val="32"/>
-                                <w:szCs w:val="32"/>
-                                <w14:glow w14:rad="38100">
-                                  <w14:schemeClr w14:val="accent1">
-                                    <w14:alpha w14:val="60000"/>
-                                  </w14:schemeClr>
-                                </w14:glow>
-                                <w14:textOutline w14:w="9525" w14:cap="flat" w14:cmpd="sng" w14:algn="ctr">
-                                  <w14:solidFill>
-                                    <w14:schemeClr w14:val="tx1">
-                                      <w14:lumMod w14:val="95000"/>
-                                      <w14:lumOff w14:val="5000"/>
-                                    </w14:schemeClr>
-                                  </w14:solidFill>
-                                  <w14:prstDash w14:val="solid"/>
-                                  <w14:round/>
-                                </w14:textOutline>
-                                <w14:textFill>
-                                  <w14:solidFill>
-                                    <w14:srgbClr w14:val="70AD47">
-                                      <w14:tint w14:val="1000"/>
-                                    </w14:srgbClr>
-                                  </w14:solidFill>
-                                </w14:textFill>
-                              </w:rPr>
-                              <w:t>999359</w:t>
                             </w:r>
                           </w:p>
                           <w:p>
@@ -1626,74 +1317,6 @@
                         </w:rPr>
                         <w:t>KATEGORİ ADI:</w:t>
                       </w:r>
-                      <w:r>
-                        <w:rPr>
-                          <w:rFonts w:ascii="Arial Black" w:hAnsi="Arial Black" w:cs="Arial"/>
-                          <w:b/>
-                          <w:bCs/>
-                          <w:color w:val="70AD47"/>
-                          <w:spacing w:val="10"/>
-                          <w:sz w:val="32"/>
-                          <w:szCs w:val="32"/>
-                          <w14:glow w14:rad="38100">
-                            <w14:schemeClr w14:val="accent1">
-                              <w14:alpha w14:val="60000"/>
-                            </w14:schemeClr>
-                          </w14:glow>
-                          <w14:textOutline w14:w="9525" w14:cap="flat" w14:cmpd="sng" w14:algn="ctr">
-                            <w14:solidFill>
-                              <w14:schemeClr w14:val="tx1">
-                                <w14:lumMod w14:val="95000"/>
-                                <w14:lumOff w14:val="5000"/>
-                              </w14:schemeClr>
-                            </w14:solidFill>
-                            <w14:prstDash w14:val="solid"/>
-                            <w14:round/>
-                          </w14:textOutline>
-                          <w14:textFill>
-                            <w14:solidFill>
-                              <w14:srgbClr w14:val="70AD47">
-                                <w14:tint w14:val="1000"/>
-                              </w14:srgbClr>
-                            </w14:solidFill>
-                          </w14:textFill>
-                        </w:rPr>
-                        <w:t xml:space="preserve"> </w:t>
-                      </w:r>
-                      <w:r>
-                        <w:rPr>
-                          <w:rFonts w:ascii="Arial Black" w:hAnsi="Arial Black" w:cs="Arial"/>
-                          <w:b/>
-                          <w:bCs/>
-                          <w:color w:val="70AD47"/>
-                          <w:spacing w:val="10"/>
-                          <w:sz w:val="32"/>
-                          <w:szCs w:val="32"/>
-                          <w14:glow w14:rad="38100">
-                            <w14:schemeClr w14:val="accent1">
-                              <w14:alpha w14:val="60000"/>
-                            </w14:schemeClr>
-                          </w14:glow>
-                          <w14:textOutline w14:w="9525" w14:cap="flat" w14:cmpd="sng" w14:algn="ctr">
-                            <w14:solidFill>
-                              <w14:schemeClr w14:val="tx1">
-                                <w14:lumMod w14:val="95000"/>
-                                <w14:lumOff w14:val="5000"/>
-                              </w14:schemeClr>
-                            </w14:solidFill>
-                            <w14:prstDash w14:val="solid"/>
-                            <w14:round/>
-                          </w14:textOutline>
-                          <w14:textFill>
-                            <w14:solidFill>
-                              <w14:srgbClr w14:val="70AD47">
-                                <w14:tint w14:val="1000"/>
-                              </w14:srgbClr>
-                            </w14:solidFill>
-                          </w14:textFill>
-                        </w:rPr>
-                        <w:t>Sanayide Robotik Uygulamalar Yarışması</w:t>
-                      </w:r>
                     </w:p>
                     <w:p>
                       <w:pPr>
@@ -1763,74 +1386,6 @@
                         </w:rPr>
                         <w:t>TAKIM ADI:</w:t>
                       </w:r>
-                      <w:r>
-                        <w:rPr>
-                          <w:rFonts w:ascii="Arial Black" w:hAnsi="Arial Black" w:cs="Arial"/>
-                          <w:b/>
-                          <w:bCs/>
-                          <w:color w:val="70AD47"/>
-                          <w:spacing w:val="10"/>
-                          <w:sz w:val="32"/>
-                          <w:szCs w:val="32"/>
-                          <w14:glow w14:rad="38100">
-                            <w14:schemeClr w14:val="accent1">
-                              <w14:alpha w14:val="60000"/>
-                            </w14:schemeClr>
-                          </w14:glow>
-                          <w14:textOutline w14:w="9525" w14:cap="flat" w14:cmpd="sng" w14:algn="ctr">
-                            <w14:solidFill>
-                              <w14:schemeClr w14:val="tx1">
-                                <w14:lumMod w14:val="95000"/>
-                                <w14:lumOff w14:val="5000"/>
-                              </w14:schemeClr>
-                            </w14:solidFill>
-                            <w14:prstDash w14:val="solid"/>
-                            <w14:round/>
-                          </w14:textOutline>
-                          <w14:textFill>
-                            <w14:solidFill>
-                              <w14:srgbClr w14:val="70AD47">
-                                <w14:tint w14:val="1000"/>
-                              </w14:srgbClr>
-                            </w14:solidFill>
-                          </w14:textFill>
-                        </w:rPr>
-                        <w:t xml:space="preserve"> </w:t>
-                      </w:r>
-                      <w:r>
-                        <w:rPr>
-                          <w:rFonts w:ascii="Arial Black" w:hAnsi="Arial Black" w:cs="Arial"/>
-                          <w:b/>
-                          <w:bCs/>
-                          <w:color w:val="70AD47"/>
-                          <w:spacing w:val="10"/>
-                          <w:sz w:val="32"/>
-                          <w:szCs w:val="32"/>
-                          <w14:glow w14:rad="38100">
-                            <w14:schemeClr w14:val="accent1">
-                              <w14:alpha w14:val="60000"/>
-                            </w14:schemeClr>
-                          </w14:glow>
-                          <w14:textOutline w14:w="9525" w14:cap="flat" w14:cmpd="sng" w14:algn="ctr">
-                            <w14:solidFill>
-                              <w14:schemeClr w14:val="tx1">
-                                <w14:lumMod w14:val="95000"/>
-                                <w14:lumOff w14:val="5000"/>
-                              </w14:schemeClr>
-                            </w14:solidFill>
-                            <w14:prstDash w14:val="solid"/>
-                            <w14:round/>
-                          </w14:textOutline>
-                          <w14:textFill>
-                            <w14:solidFill>
-                              <w14:srgbClr w14:val="70AD47">
-                                <w14:tint w14:val="1000"/>
-                              </w14:srgbClr>
-                            </w14:solidFill>
-                          </w14:textFill>
-                        </w:rPr>
-                        <w:t>VOL-İ</w:t>
-                      </w:r>
                     </w:p>
                     <w:p>
                       <w:pPr>
@@ -1898,109 +1453,7 @@
                             </w14:solidFill>
                           </w14:textFill>
                         </w:rPr>
-                        <w:t>BAŞVURU ID</w:t>
-                      </w:r>
-                      <w:r>
-                        <w:rPr>
-                          <w:rFonts w:ascii="Arial Black" w:hAnsi="Arial Black" w:cs="Arial"/>
-                          <w:b/>
-                          <w:bCs/>
-                          <w:color w:val="70AD47"/>
-                          <w:spacing w:val="10"/>
-                          <w:sz w:val="32"/>
-                          <w:szCs w:val="32"/>
-                          <w14:glow w14:rad="38100">
-                            <w14:schemeClr w14:val="accent1">
-                              <w14:alpha w14:val="60000"/>
-                            </w14:schemeClr>
-                          </w14:glow>
-                          <w14:textOutline w14:w="9525" w14:cap="flat" w14:cmpd="sng" w14:algn="ctr">
-                            <w14:solidFill>
-                              <w14:schemeClr w14:val="tx1">
-                                <w14:lumMod w14:val="95000"/>
-                                <w14:lumOff w14:val="5000"/>
-                              </w14:schemeClr>
-                            </w14:solidFill>
-                            <w14:prstDash w14:val="solid"/>
-                            <w14:round/>
-                          </w14:textOutline>
-                          <w14:textFill>
-                            <w14:solidFill>
-                              <w14:srgbClr w14:val="70AD47">
-                                <w14:tint w14:val="1000"/>
-                              </w14:srgbClr>
-                            </w14:solidFill>
-                          </w14:textFill>
-                        </w:rPr>
-                        <w:t>:</w:t>
-                      </w:r>
-                      <w:r>
-                        <w:rPr>
-                          <w:rFonts w:ascii="Arial Black" w:hAnsi="Arial Black" w:cs="Arial"/>
-                          <w:b/>
-                          <w:bCs/>
-                          <w:color w:val="70AD47"/>
-                          <w:spacing w:val="10"/>
-                          <w:sz w:val="32"/>
-                          <w:szCs w:val="32"/>
-                          <w14:glow w14:rad="38100">
-                            <w14:schemeClr w14:val="accent1">
-                              <w14:alpha w14:val="60000"/>
-                            </w14:schemeClr>
-                          </w14:glow>
-                          <w14:textOutline w14:w="9525" w14:cap="flat" w14:cmpd="sng" w14:algn="ctr">
-                            <w14:solidFill>
-                              <w14:schemeClr w14:val="tx1">
-                                <w14:lumMod w14:val="95000"/>
-                                <w14:lumOff w14:val="5000"/>
-                              </w14:schemeClr>
-                            </w14:solidFill>
-                            <w14:prstDash w14:val="solid"/>
-                            <w14:round/>
-                          </w14:textOutline>
-                          <w14:textFill>
-                            <w14:solidFill>
-                              <w14:srgbClr w14:val="70AD47">
-                                <w14:tint w14:val="1000"/>
-                              </w14:srgbClr>
-                            </w14:solidFill>
-                          </w14:textFill>
-                        </w:rPr>
-                        <w:t xml:space="preserve"> </w:t>
-                      </w:r>
-                      <w:r>
-                        <w:rPr>
-                          <w:rFonts w:ascii="Arial Black" w:hAnsi="Arial Black" w:cs="Arial"/>
-                          <w:b/>
-                          <w:bCs/>
-                          <w:color w:val="70AD47"/>
-                          <w:spacing w:val="10"/>
-                          <w:sz w:val="32"/>
-                          <w:szCs w:val="32"/>
-                          <w14:glow w14:rad="38100">
-                            <w14:schemeClr w14:val="accent1">
-                              <w14:alpha w14:val="60000"/>
-                            </w14:schemeClr>
-                          </w14:glow>
-                          <w14:textOutline w14:w="9525" w14:cap="flat" w14:cmpd="sng" w14:algn="ctr">
-                            <w14:solidFill>
-                              <w14:schemeClr w14:val="tx1">
-                                <w14:lumMod w14:val="95000"/>
-                                <w14:lumOff w14:val="5000"/>
-                              </w14:schemeClr>
-                            </w14:solidFill>
-                            <w14:prstDash w14:val="solid"/>
-                            <w14:round/>
-                          </w14:textOutline>
-                          <w14:textFill>
-                            <w14:solidFill>
-                              <w14:srgbClr w14:val="70AD47">
-                                <w14:tint w14:val="1000"/>
-                              </w14:srgbClr>
-                            </w14:solidFill>
-                          </w14:textFill>
-                        </w:rPr>
-                        <w:t>5358567</w:t>
+                        <w:t>BAŞVURU ID:</w:t>
                       </w:r>
                     </w:p>
                     <w:p>
@@ -2070,74 +1523,6 @@
                           </w14:textFill>
                         </w:rPr>
                         <w:t>TAKIM ID:</w:t>
-                      </w:r>
-                      <w:r>
-                        <w:rPr>
-                          <w:rFonts w:ascii="Arial Black" w:hAnsi="Arial Black" w:cs="Arial"/>
-                          <w:b/>
-                          <w:bCs/>
-                          <w:color w:val="70AD47"/>
-                          <w:spacing w:val="10"/>
-                          <w:sz w:val="32"/>
-                          <w:szCs w:val="32"/>
-                          <w14:glow w14:rad="38100">
-                            <w14:schemeClr w14:val="accent1">
-                              <w14:alpha w14:val="60000"/>
-                            </w14:schemeClr>
-                          </w14:glow>
-                          <w14:textOutline w14:w="9525" w14:cap="flat" w14:cmpd="sng" w14:algn="ctr">
-                            <w14:solidFill>
-                              <w14:schemeClr w14:val="tx1">
-                                <w14:lumMod w14:val="95000"/>
-                                <w14:lumOff w14:val="5000"/>
-                              </w14:schemeClr>
-                            </w14:solidFill>
-                            <w14:prstDash w14:val="solid"/>
-                            <w14:round/>
-                          </w14:textOutline>
-                          <w14:textFill>
-                            <w14:solidFill>
-                              <w14:srgbClr w14:val="70AD47">
-                                <w14:tint w14:val="1000"/>
-                              </w14:srgbClr>
-                            </w14:solidFill>
-                          </w14:textFill>
-                        </w:rPr>
-                        <w:t xml:space="preserve"> </w:t>
-                      </w:r>
-                      <w:r>
-                        <w:rPr>
-                          <w:rFonts w:ascii="Arial Black" w:hAnsi="Arial Black" w:cs="Arial"/>
-                          <w:b/>
-                          <w:bCs/>
-                          <w:color w:val="70AD47"/>
-                          <w:spacing w:val="10"/>
-                          <w:sz w:val="32"/>
-                          <w:szCs w:val="32"/>
-                          <w14:glow w14:rad="38100">
-                            <w14:schemeClr w14:val="accent1">
-                              <w14:alpha w14:val="60000"/>
-                            </w14:schemeClr>
-                          </w14:glow>
-                          <w14:textOutline w14:w="9525" w14:cap="flat" w14:cmpd="sng" w14:algn="ctr">
-                            <w14:solidFill>
-                              <w14:schemeClr w14:val="tx1">
-                                <w14:lumMod w14:val="95000"/>
-                                <w14:lumOff w14:val="5000"/>
-                              </w14:schemeClr>
-                            </w14:solidFill>
-                            <w14:prstDash w14:val="solid"/>
-                            <w14:round/>
-                          </w14:textOutline>
-                          <w14:textFill>
-                            <w14:solidFill>
-                              <w14:srgbClr w14:val="70AD47">
-                                <w14:tint w14:val="1000"/>
-                              </w14:srgbClr>
-                            </w14:solidFill>
-                          </w14:textFill>
-                        </w:rPr>
-                        <w:t>999359</w:t>
                       </w:r>
                     </w:p>
                     <w:p>
@@ -2863,12 +2248,427 @@
           <w:b/>
           <w:sz w:val="24"/>
           <w:szCs w:val="24"/>
+        </w:rPr>
+      </w:pPr>
+    </w:p>
+    <w:p>
+      <w:pPr>
+        <w:tabs>
+          <w:tab w:val="left" w:pos="5691"/>
+        </w:tabs>
+        <w:jc w:val="both"/>
+        <w:rPr>
+          <w:rFonts w:ascii="Trebuchet MS" w:hAnsi="Trebuchet MS"/>
+          <w:b/>
+          <w:sz w:val="24"/>
+          <w:szCs w:val="24"/>
+        </w:rPr>
+      </w:pPr>
+    </w:p>
+    <w:p>
+      <w:pPr>
+        <w:tabs>
+          <w:tab w:val="left" w:pos="5691"/>
+        </w:tabs>
+        <w:jc w:val="both"/>
+        <w:rPr>
+          <w:rFonts w:ascii="Trebuchet MS" w:hAnsi="Trebuchet MS"/>
+          <w:b/>
+          <w:sz w:val="24"/>
+          <w:szCs w:val="24"/>
+        </w:rPr>
+      </w:pPr>
+    </w:p>
+    <w:p>
+      <w:pPr>
+        <w:tabs>
+          <w:tab w:val="left" w:pos="5691"/>
+        </w:tabs>
+        <w:jc w:val="both"/>
+        <w:rPr>
+          <w:rFonts w:ascii="Trebuchet MS" w:hAnsi="Trebuchet MS"/>
+          <w:b/>
+          <w:sz w:val="24"/>
+          <w:szCs w:val="24"/>
+        </w:rPr>
+      </w:pPr>
+    </w:p>
+    <w:p>
+      <w:pPr>
+        <w:tabs>
+          <w:tab w:val="left" w:pos="5691"/>
+        </w:tabs>
+        <w:jc w:val="both"/>
+        <w:rPr>
+          <w:rFonts w:ascii="Trebuchet MS" w:hAnsi="Trebuchet MS"/>
+          <w:b/>
+          <w:sz w:val="24"/>
+          <w:szCs w:val="24"/>
+        </w:rPr>
+      </w:pPr>
+      <w:r>
+        <w:rPr>
+          <w:rFonts w:ascii="Trebuchet MS" w:hAnsi="Trebuchet MS"/>
+          <w:b/>
+          <w:sz w:val="24"/>
+          <w:szCs w:val="24"/>
+        </w:rPr>
+        <w:t>TEKNİK YETERLİLİK FORMU DOLDURULURKEN DİKKAT EDİLMESİ GEREKEN HUSUSLAR:</w:t>
+      </w:r>
+    </w:p>
+    <w:p>
+      <w:pPr>
+        <w:tabs>
+          <w:tab w:val="left" w:pos="5691"/>
+        </w:tabs>
+        <w:jc w:val="both"/>
+        <w:rPr>
+          <w:rFonts w:ascii="Trebuchet MS" w:hAnsi="Trebuchet MS"/>
+          <w:b/>
+          <w:sz w:val="24"/>
+          <w:szCs w:val="24"/>
+        </w:rPr>
+      </w:pPr>
+    </w:p>
+    <w:p>
+      <w:pPr>
+        <w:pStyle w:val="ListeParagraf"/>
+        <w:numPr>
+          <w:ilvl w:val="0"/>
+          <w:numId w:val="46"/>
+        </w:numPr>
+        <w:tabs>
+          <w:tab w:val="left" w:pos="5691"/>
+        </w:tabs>
+        <w:jc w:val="both"/>
+        <w:rPr>
+          <w:rFonts w:ascii="Trebuchet MS" w:hAnsi="Trebuchet MS"/>
+          <w:sz w:val="24"/>
+          <w:szCs w:val="24"/>
+        </w:rPr>
+      </w:pPr>
+      <w:r>
+        <w:rPr>
+          <w:rFonts w:ascii="Trebuchet MS" w:hAnsi="Trebuchet MS"/>
+          <w:sz w:val="24"/>
+          <w:szCs w:val="24"/>
+        </w:rPr>
+        <w:t xml:space="preserve">Özel olarak belirtilen başlıklar haricinde form içerisinde yer alan bileşen isimlerinden başka bileşen ismi </w:t>
+      </w:r>
+      <w:r>
+        <w:rPr>
+          <w:rFonts w:ascii="Trebuchet MS" w:hAnsi="Trebuchet MS"/>
+          <w:b/>
+          <w:sz w:val="24"/>
+          <w:szCs w:val="24"/>
           <w:u w:val="single"/>
         </w:rPr>
-      </w:pPr>
+        <w:t>eklenmemelidir.</w:t>
+      </w:r>
+      <w:r>
+        <w:rPr>
+          <w:rFonts w:ascii="Trebuchet MS" w:hAnsi="Trebuchet MS"/>
+          <w:sz w:val="24"/>
+          <w:szCs w:val="24"/>
+        </w:rPr>
+        <w:t xml:space="preserve"> </w:t>
+      </w:r>
     </w:p>
     <w:p>
       <w:pPr>
+        <w:pStyle w:val="ListeParagraf"/>
+        <w:numPr>
+          <w:ilvl w:val="0"/>
+          <w:numId w:val="46"/>
+        </w:numPr>
+        <w:tabs>
+          <w:tab w:val="left" w:pos="5691"/>
+        </w:tabs>
+        <w:jc w:val="both"/>
+        <w:rPr>
+          <w:rFonts w:ascii="Trebuchet MS" w:hAnsi="Trebuchet MS"/>
+          <w:sz w:val="24"/>
+          <w:szCs w:val="24"/>
+        </w:rPr>
+      </w:pPr>
+      <w:r>
+        <w:rPr>
+          <w:rFonts w:ascii="Trebuchet MS" w:hAnsi="Trebuchet MS"/>
+          <w:sz w:val="24"/>
+          <w:szCs w:val="24"/>
+        </w:rPr>
+        <w:t xml:space="preserve">Aynı bileşenden </w:t>
+      </w:r>
+      <w:r>
+        <w:rPr>
+          <w:rFonts w:ascii="Trebuchet MS" w:hAnsi="Trebuchet MS"/>
+          <w:b/>
+          <w:bCs/>
+          <w:sz w:val="24"/>
+          <w:szCs w:val="24"/>
+          <w:u w:val="single"/>
+        </w:rPr>
+        <w:t>birbirinden</w:t>
+      </w:r>
+      <w:r>
+        <w:rPr>
+          <w:rFonts w:ascii="Trebuchet MS" w:hAnsi="Trebuchet MS"/>
+          <w:b/>
+          <w:sz w:val="24"/>
+          <w:szCs w:val="24"/>
+          <w:u w:val="single"/>
+        </w:rPr>
+        <w:t xml:space="preserve"> farklı olmak kaydıyla birden fazla kullanılıyorsa</w:t>
+      </w:r>
+      <w:r>
+        <w:rPr>
+          <w:rFonts w:ascii="Trebuchet MS" w:hAnsi="Trebuchet MS"/>
+          <w:sz w:val="24"/>
+          <w:szCs w:val="24"/>
+        </w:rPr>
+        <w:t xml:space="preserve"> aynı bileşen ismi için yeni satır açılabilir</w:t>
+      </w:r>
+      <w:r>
+        <w:rPr>
+          <w:rFonts w:ascii="Trebuchet MS" w:hAnsi="Trebuchet MS"/>
+          <w:sz w:val="24"/>
+          <w:szCs w:val="24"/>
+        </w:rPr>
+        <w:t>.</w:t>
+      </w:r>
+    </w:p>
+    <w:p>
+      <w:pPr>
+        <w:pStyle w:val="ListeParagraf"/>
+        <w:numPr>
+          <w:ilvl w:val="0"/>
+          <w:numId w:val="47"/>
+        </w:numPr>
+        <w:tabs>
+          <w:tab w:val="left" w:pos="5691"/>
+        </w:tabs>
+        <w:jc w:val="both"/>
+        <w:rPr>
+          <w:rFonts w:ascii="Trebuchet MS" w:hAnsi="Trebuchet MS"/>
+          <w:sz w:val="24"/>
+          <w:szCs w:val="24"/>
+        </w:rPr>
+      </w:pPr>
+      <w:r>
+        <w:rPr>
+          <w:rFonts w:ascii="Trebuchet MS" w:hAnsi="Trebuchet MS"/>
+          <w:sz w:val="24"/>
+          <w:szCs w:val="24"/>
+        </w:rPr>
+        <w:t xml:space="preserve">Form genelinde bulunan tablolarda </w:t>
+      </w:r>
+      <w:r>
+        <w:rPr>
+          <w:rFonts w:ascii="Trebuchet MS" w:hAnsi="Trebuchet MS"/>
+          <w:b/>
+          <w:bCs/>
+          <w:sz w:val="24"/>
+          <w:szCs w:val="24"/>
+          <w:u w:val="single"/>
+        </w:rPr>
+        <w:t>ihtiyaç dahilinde</w:t>
+      </w:r>
+      <w:r>
+        <w:rPr>
+          <w:rFonts w:ascii="Trebuchet MS" w:hAnsi="Trebuchet MS"/>
+          <w:sz w:val="24"/>
+          <w:szCs w:val="24"/>
+        </w:rPr>
+        <w:t xml:space="preserve"> satır sayısı artırılabilir.</w:t>
+      </w:r>
+    </w:p>
+    <w:p>
+      <w:pPr>
+        <w:pStyle w:val="ListeParagraf"/>
+        <w:numPr>
+          <w:ilvl w:val="0"/>
+          <w:numId w:val="47"/>
+        </w:numPr>
+        <w:tabs>
+          <w:tab w:val="left" w:pos="5691"/>
+        </w:tabs>
+        <w:jc w:val="both"/>
+        <w:rPr>
+          <w:rFonts w:ascii="Trebuchet MS" w:hAnsi="Trebuchet MS"/>
+          <w:sz w:val="24"/>
+          <w:szCs w:val="24"/>
+        </w:rPr>
+      </w:pPr>
+      <w:r>
+        <w:rPr>
+          <w:rFonts w:ascii="Trebuchet MS" w:hAnsi="Trebuchet MS"/>
+          <w:sz w:val="24"/>
+          <w:szCs w:val="24"/>
+        </w:rPr>
+        <w:t xml:space="preserve">Başlık isimlerinden herhangi biri (üretici, model, özellik ya da fiyat) bileşen için </w:t>
+      </w:r>
+      <w:r>
+        <w:rPr>
+          <w:rFonts w:ascii="Trebuchet MS" w:hAnsi="Trebuchet MS"/>
+          <w:b/>
+          <w:sz w:val="24"/>
+          <w:szCs w:val="24"/>
+          <w:u w:val="single"/>
+        </w:rPr>
+        <w:t>uygulanabilir değilse veya ilgili kutucuğa dair bilgi bulunmuyorsa o kutucuk boş bırakılabilir.</w:t>
+      </w:r>
+      <w:r>
+        <w:rPr>
+          <w:rFonts w:ascii="Trebuchet MS" w:hAnsi="Trebuchet MS"/>
+          <w:sz w:val="24"/>
+          <w:szCs w:val="24"/>
+        </w:rPr>
+        <w:t xml:space="preserve"> Örneğin; fiyat sütunu açık kaynak kodlu yazılımlar için uygulanabilir olmadığından bu kutucuk boş bırakılabilir.</w:t>
+      </w:r>
+    </w:p>
+    <w:p>
+      <w:pPr>
+        <w:pStyle w:val="ListeParagraf"/>
+        <w:numPr>
+          <w:ilvl w:val="0"/>
+          <w:numId w:val="47"/>
+        </w:numPr>
+        <w:tabs>
+          <w:tab w:val="left" w:pos="5691"/>
+        </w:tabs>
+        <w:jc w:val="both"/>
+        <w:rPr>
+          <w:rFonts w:ascii="Trebuchet MS" w:hAnsi="Trebuchet MS"/>
+          <w:sz w:val="24"/>
+          <w:szCs w:val="24"/>
+        </w:rPr>
+      </w:pPr>
+      <w:r>
+        <w:rPr>
+          <w:rFonts w:ascii="Trebuchet MS" w:hAnsi="Trebuchet MS"/>
+          <w:b/>
+          <w:bCs/>
+          <w:sz w:val="24"/>
+          <w:szCs w:val="24"/>
+          <w:u w:val="single"/>
+        </w:rPr>
+        <w:t>Bileşenler takımın kendisi tarafından tasarlanıyorsa</w:t>
+      </w:r>
+      <w:r>
+        <w:rPr>
+          <w:rFonts w:ascii="Trebuchet MS" w:hAnsi="Trebuchet MS"/>
+          <w:sz w:val="24"/>
+          <w:szCs w:val="24"/>
+        </w:rPr>
+        <w:t xml:space="preserve"> üretici sütunu altına takım ismi yazılması yeterlidir.</w:t>
+      </w:r>
+    </w:p>
+    <w:p>
+      <w:pPr>
+        <w:pStyle w:val="ListeParagraf"/>
+        <w:numPr>
+          <w:ilvl w:val="0"/>
+          <w:numId w:val="47"/>
+        </w:numPr>
+        <w:tabs>
+          <w:tab w:val="left" w:pos="5691"/>
+        </w:tabs>
+        <w:jc w:val="both"/>
+        <w:rPr>
+          <w:rFonts w:ascii="Trebuchet MS" w:hAnsi="Trebuchet MS"/>
+          <w:sz w:val="24"/>
+          <w:szCs w:val="24"/>
+        </w:rPr>
+      </w:pPr>
+      <w:r>
+        <w:rPr>
+          <w:rFonts w:ascii="Trebuchet MS" w:hAnsi="Trebuchet MS"/>
+          <w:sz w:val="24"/>
+          <w:szCs w:val="24"/>
+        </w:rPr>
+        <w:t xml:space="preserve">Bileşen fiyatları </w:t>
+      </w:r>
+      <w:r>
+        <w:rPr>
+          <w:rFonts w:ascii="Trebuchet MS" w:hAnsi="Trebuchet MS"/>
+          <w:b/>
+          <w:bCs/>
+          <w:sz w:val="24"/>
+          <w:szCs w:val="24"/>
+          <w:u w:val="single"/>
+        </w:rPr>
+        <w:t>TL cinsinden</w:t>
+      </w:r>
+      <w:r>
+        <w:rPr>
+          <w:rFonts w:ascii="Trebuchet MS" w:hAnsi="Trebuchet MS"/>
+          <w:sz w:val="24"/>
+          <w:szCs w:val="24"/>
+        </w:rPr>
+        <w:t xml:space="preserve"> belirtilmelidir. İlgili bileşen TL dışında bir para birimiyle temin edildiyse TL cinsinden yazılmalıdır.</w:t>
+      </w:r>
+    </w:p>
+    <w:p>
+      <w:pPr>
+        <w:pStyle w:val="ListeParagraf"/>
+        <w:numPr>
+          <w:ilvl w:val="0"/>
+          <w:numId w:val="47"/>
+        </w:numPr>
+        <w:tabs>
+          <w:tab w:val="left" w:pos="5691"/>
+        </w:tabs>
+        <w:jc w:val="both"/>
+        <w:rPr>
+          <w:rFonts w:ascii="Trebuchet MS" w:hAnsi="Trebuchet MS"/>
+          <w:sz w:val="24"/>
+          <w:szCs w:val="24"/>
+        </w:rPr>
+      </w:pPr>
+      <w:r>
+        <w:rPr>
+          <w:rFonts w:ascii="Trebuchet MS" w:hAnsi="Trebuchet MS"/>
+          <w:b/>
+          <w:sz w:val="24"/>
+          <w:szCs w:val="24"/>
+          <w:u w:val="single"/>
+        </w:rPr>
+        <w:t>Takım envanterinde yer alan</w:t>
+      </w:r>
+      <w:r>
+        <w:rPr>
+          <w:rFonts w:ascii="Trebuchet MS" w:hAnsi="Trebuchet MS"/>
+          <w:sz w:val="24"/>
+          <w:szCs w:val="24"/>
+        </w:rPr>
+        <w:t xml:space="preserve"> bileşen için ödeme yapılmayacaksa fiyat sütunu altına </w:t>
+      </w:r>
+      <w:r>
+        <w:rPr>
+          <w:rFonts w:ascii="Trebuchet MS" w:hAnsi="Trebuchet MS"/>
+          <w:b/>
+          <w:sz w:val="24"/>
+          <w:szCs w:val="24"/>
+          <w:u w:val="single"/>
+        </w:rPr>
+        <w:t>“envanter”</w:t>
+      </w:r>
+      <w:r>
+        <w:rPr>
+          <w:rFonts w:ascii="Trebuchet MS" w:hAnsi="Trebuchet MS"/>
+          <w:sz w:val="24"/>
+          <w:szCs w:val="24"/>
+        </w:rPr>
+        <w:t xml:space="preserve"> yazılabilir.</w:t>
+      </w:r>
+    </w:p>
+    <w:p>
+      <w:pPr>
+        <w:pStyle w:val="ListeParagraf"/>
+        <w:numPr>
+          <w:ilvl w:val="0"/>
+          <w:numId w:val="47"/>
+        </w:numPr>
         <w:tabs>
           <w:tab w:val="left" w:pos="5691"/>
         </w:tabs>
@@ -2881,10 +2681,337 @@
           <w:u w:val="single"/>
         </w:rPr>
       </w:pPr>
+      <w:r>
+        <w:rPr>
+          <w:rFonts w:ascii="Trebuchet MS" w:hAnsi="Trebuchet MS"/>
+          <w:sz w:val="24"/>
+          <w:szCs w:val="24"/>
+        </w:rPr>
+        <w:t xml:space="preserve">Formun en sonunda yer alan toplam fiyat bilgisi kısmı </w:t>
+      </w:r>
+      <w:r>
+        <w:rPr>
+          <w:rFonts w:ascii="Trebuchet MS" w:hAnsi="Trebuchet MS"/>
+          <w:b/>
+          <w:sz w:val="24"/>
+          <w:szCs w:val="24"/>
+          <w:u w:val="single"/>
+        </w:rPr>
+        <w:t>doldurulmak zorundadır.</w:t>
+      </w:r>
+    </w:p>
+    <w:p>
+      <w:pPr>
+        <w:pStyle w:val="ListeParagraf"/>
+        <w:numPr>
+          <w:ilvl w:val="0"/>
+          <w:numId w:val="47"/>
+        </w:numPr>
+        <w:tabs>
+          <w:tab w:val="left" w:pos="5691"/>
+        </w:tabs>
+        <w:jc w:val="both"/>
+        <w:rPr>
+          <w:rFonts w:ascii="Trebuchet MS" w:hAnsi="Trebuchet MS"/>
+          <w:bCs/>
+          <w:sz w:val="24"/>
+          <w:szCs w:val="24"/>
+        </w:rPr>
+      </w:pPr>
+      <w:r>
+        <w:rPr>
+          <w:rFonts w:ascii="Trebuchet MS" w:hAnsi="Trebuchet MS"/>
+          <w:bCs/>
+          <w:sz w:val="24"/>
+          <w:szCs w:val="24"/>
+        </w:rPr>
+        <w:t>Format içerisinde yer alan kapaklar haricinde</w:t>
+      </w:r>
+      <w:r>
+        <w:rPr>
+          <w:rFonts w:ascii="Trebuchet MS" w:hAnsi="Trebuchet MS"/>
+          <w:bCs/>
+          <w:sz w:val="24"/>
+          <w:szCs w:val="24"/>
+        </w:rPr>
+        <w:t>,</w:t>
+      </w:r>
+      <w:r>
+        <w:rPr>
+          <w:rFonts w:ascii="Trebuchet MS" w:hAnsi="Trebuchet MS"/>
+          <w:bCs/>
+          <w:sz w:val="24"/>
+          <w:szCs w:val="24"/>
+        </w:rPr>
+        <w:t xml:space="preserve"> doldurulacak olan form </w:t>
+      </w:r>
+      <w:r>
+        <w:rPr>
+          <w:rFonts w:ascii="Trebuchet MS" w:hAnsi="Trebuchet MS"/>
+          <w:b/>
+          <w:sz w:val="24"/>
+          <w:szCs w:val="24"/>
+          <w:u w:val="single"/>
+        </w:rPr>
+        <w:t>maksimum</w:t>
+      </w:r>
+      <w:r>
+        <w:rPr>
+          <w:rFonts w:ascii="Trebuchet MS" w:hAnsi="Trebuchet MS"/>
+          <w:b/>
+          <w:sz w:val="24"/>
+          <w:szCs w:val="24"/>
+          <w:u w:val="single"/>
+        </w:rPr>
+        <w:t xml:space="preserve"> </w:t>
+      </w:r>
+      <w:r>
+        <w:rPr>
+          <w:rFonts w:ascii="Trebuchet MS" w:hAnsi="Trebuchet MS"/>
+          <w:b/>
+          <w:sz w:val="24"/>
+          <w:szCs w:val="24"/>
+          <w:u w:val="single"/>
+        </w:rPr>
+        <w:t>10 sayfadan</w:t>
+      </w:r>
+      <w:r>
+        <w:rPr>
+          <w:rFonts w:ascii="Trebuchet MS" w:hAnsi="Trebuchet MS"/>
+          <w:bCs/>
+          <w:sz w:val="24"/>
+          <w:szCs w:val="24"/>
+        </w:rPr>
+        <w:t xml:space="preserve"> oluşmalıdır. 10 sayfayı aşan formlar </w:t>
+      </w:r>
+      <w:r>
+        <w:rPr>
+          <w:rFonts w:ascii="Trebuchet MS" w:hAnsi="Trebuchet MS"/>
+          <w:b/>
+          <w:sz w:val="24"/>
+          <w:szCs w:val="24"/>
+          <w:u w:val="single"/>
+        </w:rPr>
+        <w:t>değerlendirilmeye alınmayacaktır.</w:t>
+      </w:r>
+      <w:r>
+        <w:rPr>
+          <w:rFonts w:ascii="Trebuchet MS" w:hAnsi="Trebuchet MS"/>
+          <w:b/>
+          <w:sz w:val="24"/>
+          <w:szCs w:val="24"/>
+          <w:u w:val="single"/>
+        </w:rPr>
+        <w:t xml:space="preserve"> </w:t>
+      </w:r>
+      <w:r>
+        <w:rPr>
+          <w:rFonts w:ascii="Trebuchet MS" w:hAnsi="Trebuchet MS"/>
+          <w:bCs/>
+          <w:sz w:val="24"/>
+          <w:szCs w:val="24"/>
+        </w:rPr>
+        <w:t>(Yüklenecek olan formlar kapaklar dahil maksimum 12 sayfa olmalıdır.)</w:t>
+      </w:r>
+    </w:p>
+    <w:p>
+      <w:pPr>
+        <w:tabs>
+          <w:tab w:val="left" w:pos="5691"/>
+        </w:tabs>
+        <w:jc w:val="both"/>
+        <w:rPr>
+          <w:rFonts w:ascii="Trebuchet MS" w:hAnsi="Trebuchet MS"/>
+          <w:b/>
+          <w:sz w:val="24"/>
+          <w:szCs w:val="24"/>
+          <w:u w:val="single"/>
+        </w:rPr>
+      </w:pPr>
+    </w:p>
+    <w:p>
+      <w:pPr>
+        <w:tabs>
+          <w:tab w:val="left" w:pos="5691"/>
+        </w:tabs>
+        <w:jc w:val="both"/>
+        <w:rPr>
+          <w:rFonts w:ascii="Trebuchet MS" w:hAnsi="Trebuchet MS"/>
+          <w:b/>
+          <w:sz w:val="24"/>
+          <w:szCs w:val="24"/>
+          <w:u w:val="single"/>
+        </w:rPr>
+      </w:pPr>
+    </w:p>
+    <w:p>
+      <w:pPr>
+        <w:tabs>
+          <w:tab w:val="left" w:pos="5691"/>
+        </w:tabs>
+        <w:jc w:val="both"/>
+        <w:rPr>
+          <w:rFonts w:ascii="Trebuchet MS" w:hAnsi="Trebuchet MS"/>
+          <w:b/>
+          <w:sz w:val="24"/>
+          <w:szCs w:val="24"/>
+          <w:u w:val="single"/>
+        </w:rPr>
+      </w:pPr>
+    </w:p>
+    <w:p>
+      <w:pPr>
+        <w:tabs>
+          <w:tab w:val="left" w:pos="5691"/>
+        </w:tabs>
+        <w:jc w:val="both"/>
+        <w:rPr>
+          <w:rFonts w:ascii="Trebuchet MS" w:hAnsi="Trebuchet MS"/>
+          <w:b/>
+          <w:sz w:val="24"/>
+          <w:szCs w:val="24"/>
+          <w:u w:val="single"/>
+        </w:rPr>
+      </w:pPr>
+    </w:p>
+    <w:p>
+      <w:pPr>
+        <w:tabs>
+          <w:tab w:val="left" w:pos="5691"/>
+        </w:tabs>
+        <w:jc w:val="both"/>
+        <w:rPr>
+          <w:rFonts w:ascii="Trebuchet MS" w:hAnsi="Trebuchet MS"/>
+          <w:b/>
+          <w:sz w:val="24"/>
+          <w:szCs w:val="24"/>
+          <w:u w:val="single"/>
+        </w:rPr>
+      </w:pPr>
+    </w:p>
+    <w:p>
+      <w:pPr>
+        <w:tabs>
+          <w:tab w:val="left" w:pos="5691"/>
+        </w:tabs>
+        <w:jc w:val="both"/>
+        <w:rPr>
+          <w:rFonts w:ascii="Trebuchet MS" w:hAnsi="Trebuchet MS"/>
+          <w:b/>
+          <w:sz w:val="24"/>
+          <w:szCs w:val="24"/>
+          <w:u w:val="single"/>
+        </w:rPr>
+      </w:pPr>
+    </w:p>
+    <w:p>
+      <w:pPr>
+        <w:tabs>
+          <w:tab w:val="left" w:pos="5691"/>
+        </w:tabs>
+        <w:jc w:val="both"/>
+        <w:rPr>
+          <w:rFonts w:ascii="Trebuchet MS" w:hAnsi="Trebuchet MS"/>
+          <w:b/>
+          <w:sz w:val="24"/>
+          <w:szCs w:val="24"/>
+          <w:u w:val="single"/>
+        </w:rPr>
+      </w:pPr>
+    </w:p>
+    <w:p>
+      <w:pPr>
+        <w:tabs>
+          <w:tab w:val="left" w:pos="5691"/>
+        </w:tabs>
+        <w:jc w:val="both"/>
+        <w:rPr>
+          <w:rFonts w:ascii="Trebuchet MS" w:hAnsi="Trebuchet MS"/>
+          <w:b/>
+          <w:sz w:val="24"/>
+          <w:szCs w:val="24"/>
+          <w:u w:val="single"/>
+        </w:rPr>
+      </w:pPr>
+    </w:p>
+    <w:p>
+      <w:pPr>
+        <w:tabs>
+          <w:tab w:val="left" w:pos="5691"/>
+        </w:tabs>
+        <w:jc w:val="both"/>
+        <w:rPr>
+          <w:rFonts w:ascii="Trebuchet MS" w:hAnsi="Trebuchet MS"/>
+          <w:b/>
+          <w:sz w:val="24"/>
+          <w:szCs w:val="24"/>
+          <w:u w:val="single"/>
+        </w:rPr>
+      </w:pPr>
+    </w:p>
+    <w:p>
+      <w:pPr>
+        <w:tabs>
+          <w:tab w:val="left" w:pos="5691"/>
+        </w:tabs>
+        <w:jc w:val="both"/>
+        <w:rPr>
+          <w:rFonts w:ascii="Trebuchet MS" w:hAnsi="Trebuchet MS"/>
+          <w:b/>
+          <w:sz w:val="24"/>
+          <w:szCs w:val="24"/>
+          <w:u w:val="single"/>
+        </w:rPr>
+      </w:pPr>
+    </w:p>
+    <w:p>
+      <w:pPr>
+        <w:tabs>
+          <w:tab w:val="left" w:pos="5691"/>
+        </w:tabs>
+        <w:jc w:val="both"/>
+        <w:rPr>
+          <w:rFonts w:ascii="Trebuchet MS" w:hAnsi="Trebuchet MS"/>
+          <w:b/>
+          <w:sz w:val="24"/>
+          <w:szCs w:val="24"/>
+          <w:u w:val="single"/>
+        </w:rPr>
+      </w:pPr>
+    </w:p>
+    <w:p>
+      <w:pPr>
+        <w:tabs>
+          <w:tab w:val="left" w:pos="5691"/>
+        </w:tabs>
+        <w:jc w:val="both"/>
+        <w:rPr>
+          <w:rFonts w:ascii="Trebuchet MS" w:hAnsi="Trebuchet MS"/>
+          <w:b/>
+          <w:sz w:val="24"/>
+          <w:szCs w:val="24"/>
+          <w:u w:val="single"/>
+        </w:rPr>
+      </w:pPr>
+    </w:p>
+    <w:p>
+      <w:pPr>
+        <w:tabs>
+          <w:tab w:val="left" w:pos="5691"/>
+        </w:tabs>
+        <w:jc w:val="both"/>
+        <w:rPr>
+          <w:rFonts w:ascii="Trebuchet MS" w:hAnsi="Trebuchet MS"/>
+          <w:b/>
+          <w:sz w:val="24"/>
+          <w:szCs w:val="24"/>
+          <w:u w:val="single"/>
+        </w:rPr>
+      </w:pPr>
     </w:p>
     <w:tbl>
       <w:tblPr>
-        <w:tblStyle w:val="TableGrid"/>
+        <w:tblStyle w:val="TabloKlavuzu"/>
         <w:tblW w:w="0" w:type="auto"/>
         <w:tblInd w:w="-40" w:type="dxa"/>
         <w:tblLook w:val="04A0" w:firstRow="1" w:lastRow="0" w:firstColumn="1" w:lastColumn="0" w:noHBand="0" w:noVBand="1"/>
@@ -2948,1246 +3075,372 @@
           </w:tcPr>
           <w:p>
             <w:pPr>
+              <w:pStyle w:val="ListeParagraf"/>
+              <w:spacing w:line="276" w:lineRule="auto"/>
+              <w:rPr>
+                <w:rFonts w:ascii="Trebuchet MS" w:hAnsi="Trebuchet MS" w:cs="Arial"/>
+                <w:sz w:val="24"/>
+                <w:szCs w:val="24"/>
+                <w:lang w:eastAsia="tr-TR" w:bidi="tr-TR"/>
+              </w:rPr>
+            </w:pPr>
+          </w:p>
+          <w:p>
+            <w:pPr>
+              <w:pStyle w:val="ListeParagraf"/>
+              <w:numPr>
+                <w:ilvl w:val="0"/>
+                <w:numId w:val="48"/>
+              </w:numPr>
               <w:spacing w:line="276" w:lineRule="auto"/>
               <w:jc w:val="both"/>
               <w:rPr>
                 <w:rFonts w:ascii="Trebuchet MS" w:hAnsi="Trebuchet MS" w:cs="Arial"/>
-                <w:sz w:val="24"/>
-                <w:szCs w:val="24"/>
-                <w:lang w:val="en-US" w:eastAsia="tr-TR" w:bidi="tr-TR"/>
-              </w:rPr>
-            </w:pPr>
-          </w:p>
-          <w:p>
-            <w:pPr>
+                <w:i/>
+                <w:sz w:val="24"/>
+                <w:szCs w:val="24"/>
+                <w:lang w:eastAsia="tr-TR" w:bidi="tr-TR"/>
+              </w:rPr>
+            </w:pPr>
+            <w:r>
+              <w:rPr>
+                <w:rFonts w:ascii="Trebuchet MS" w:hAnsi="Trebuchet MS" w:cs="Arial"/>
+                <w:i/>
+                <w:sz w:val="24"/>
+                <w:szCs w:val="24"/>
+                <w:lang w:eastAsia="tr-TR" w:bidi="tr-TR"/>
+              </w:rPr>
+              <w:t xml:space="preserve">Sanayide Dijital Teknolojiler </w:t>
+            </w:r>
+            <w:r>
+              <w:rPr>
+                <w:rFonts w:ascii="Trebuchet MS" w:hAnsi="Trebuchet MS" w:cs="Arial"/>
+                <w:i/>
+                <w:sz w:val="24"/>
+                <w:szCs w:val="24"/>
+                <w:lang w:eastAsia="tr-TR" w:bidi="tr-TR"/>
+              </w:rPr>
+              <w:t>Yarışması’na</w:t>
+            </w:r>
+            <w:r>
+              <w:rPr>
+                <w:rFonts w:ascii="Trebuchet MS" w:hAnsi="Trebuchet MS" w:cs="Arial"/>
+                <w:i/>
+                <w:sz w:val="24"/>
+                <w:szCs w:val="24"/>
+                <w:lang w:eastAsia="tr-TR" w:bidi="tr-TR"/>
+              </w:rPr>
+              <w:t xml:space="preserve"> katılmak isteyen takım ile ilgili kısa bir tanıtım yazısı beklenmektedir. </w:t>
+            </w:r>
+          </w:p>
+          <w:p>
+            <w:pPr>
+              <w:pStyle w:val="ListeParagraf"/>
+              <w:numPr>
+                <w:ilvl w:val="0"/>
+                <w:numId w:val="48"/>
+              </w:numPr>
               <w:spacing w:line="276" w:lineRule="auto"/>
               <w:jc w:val="both"/>
               <w:rPr>
                 <w:rFonts w:ascii="Trebuchet MS" w:hAnsi="Trebuchet MS" w:cs="Arial"/>
-                <w:sz w:val="24"/>
-                <w:szCs w:val="24"/>
-                <w:lang w:val="en-US" w:eastAsia="tr-TR" w:bidi="tr-TR"/>
+                <w:i/>
+                <w:sz w:val="24"/>
+                <w:szCs w:val="24"/>
+                <w:lang w:eastAsia="tr-TR" w:bidi="tr-TR"/>
               </w:rPr>
             </w:pPr>
             <w:r>
               <w:rPr>
                 <w:rFonts w:ascii="Trebuchet MS" w:hAnsi="Trebuchet MS" w:cs="Arial"/>
-                <w:sz w:val="24"/>
-                <w:szCs w:val="24"/>
-                <w:lang w:val="en-US" w:eastAsia="tr-TR" w:bidi="tr-TR"/>
-              </w:rPr>
-              <w:t>VOL-İ, D</w:t>
+                <w:i/>
+                <w:sz w:val="24"/>
+                <w:szCs w:val="24"/>
+                <w:lang w:eastAsia="tr-TR" w:bidi="tr-TR"/>
+              </w:rPr>
+              <w:t>Takım tanıtım yazısı</w:t>
+            </w:r>
+            <w:r>
+              <w:rPr>
+                <w:rFonts w:ascii="Trebuchet MS" w:hAnsi="Trebuchet MS" w:cs="Arial"/>
+                <w:i/>
+                <w:sz w:val="24"/>
+                <w:szCs w:val="24"/>
+                <w:lang w:eastAsia="tr-TR" w:bidi="tr-TR"/>
+              </w:rPr>
+              <w:t>nın</w:t>
+            </w:r>
+            <w:r>
+              <w:rPr>
+                <w:rFonts w:ascii="Trebuchet MS" w:hAnsi="Trebuchet MS" w:cs="Arial"/>
+                <w:i/>
+                <w:sz w:val="24"/>
+                <w:szCs w:val="24"/>
+                <w:lang w:eastAsia="tr-TR" w:bidi="tr-TR"/>
+              </w:rPr>
+              <w:t xml:space="preserve"> </w:t>
+            </w:r>
+            <w:r>
+              <w:rPr>
+                <w:rFonts w:ascii="Trebuchet MS" w:hAnsi="Trebuchet MS" w:cs="Arial"/>
+                <w:b/>
+                <w:i/>
+                <w:sz w:val="24"/>
+                <w:szCs w:val="24"/>
+                <w:u w:val="single"/>
+                <w:lang w:eastAsia="tr-TR" w:bidi="tr-TR"/>
+              </w:rPr>
+              <w:t xml:space="preserve">100 </w:t>
+            </w:r>
+            <w:r>
+              <w:rPr>
+                <w:rFonts w:ascii="Trebuchet MS" w:hAnsi="Trebuchet MS" w:cs="Arial"/>
+                <w:b/>
+                <w:i/>
+                <w:sz w:val="24"/>
+                <w:szCs w:val="24"/>
+                <w:u w:val="single"/>
+                <w:lang w:eastAsia="tr-TR" w:bidi="tr-TR"/>
+              </w:rPr>
+              <w:t>kelimeyi</w:t>
+            </w:r>
+            <w:r>
+              <w:rPr>
+                <w:rFonts w:ascii="Trebuchet MS" w:hAnsi="Trebuchet MS" w:cs="Arial"/>
+                <w:b/>
+                <w:i/>
+                <w:sz w:val="24"/>
+                <w:szCs w:val="24"/>
+                <w:u w:val="single"/>
+                <w:lang w:eastAsia="tr-TR" w:bidi="tr-TR"/>
+              </w:rPr>
+              <w:t xml:space="preserve"> geçmemesi</w:t>
+            </w:r>
+            <w:r>
+              <w:rPr>
+                <w:rFonts w:ascii="Trebuchet MS" w:hAnsi="Trebuchet MS" w:cs="Arial"/>
+                <w:i/>
+                <w:sz w:val="24"/>
+                <w:szCs w:val="24"/>
+                <w:lang w:eastAsia="tr-TR" w:bidi="tr-TR"/>
+              </w:rPr>
+              <w:t xml:space="preserve"> gereklidir.</w:t>
+            </w:r>
+          </w:p>
+          <w:p>
+            <w:pPr>
+              <w:pStyle w:val="ListeParagraf"/>
+              <w:numPr>
+                <w:ilvl w:val="0"/>
+                <w:numId w:val="48"/>
+              </w:numPr>
+              <w:spacing w:line="276" w:lineRule="auto"/>
+              <w:jc w:val="both"/>
+              <w:rPr>
+                <w:rFonts w:ascii="Trebuchet MS" w:hAnsi="Trebuchet MS" w:cs="Arial"/>
+                <w:i/>
+                <w:sz w:val="24"/>
+                <w:szCs w:val="24"/>
+                <w:lang w:eastAsia="tr-TR" w:bidi="tr-TR"/>
+              </w:rPr>
+            </w:pPr>
+            <w:r>
+              <w:rPr>
+                <w:rFonts w:ascii="Trebuchet MS" w:hAnsi="Trebuchet MS" w:cs="Arial"/>
+                <w:i/>
+                <w:sz w:val="24"/>
+                <w:szCs w:val="24"/>
+                <w:lang w:eastAsia="tr-TR" w:bidi="tr-TR"/>
+              </w:rPr>
+              <w:t xml:space="preserve">Takım tanıtım yazısının yanında </w:t>
+            </w:r>
+            <w:r>
+              <w:rPr>
+                <w:rFonts w:ascii="Trebuchet MS" w:hAnsi="Trebuchet MS" w:cs="Arial"/>
+                <w:b/>
+                <w:i/>
+                <w:sz w:val="24"/>
+                <w:szCs w:val="24"/>
+                <w:u w:val="single"/>
+                <w:lang w:eastAsia="tr-TR" w:bidi="tr-TR"/>
+              </w:rPr>
+              <w:t>görev dağılım ve ekip organizasyon şemasının da bu bölüme</w:t>
+            </w:r>
+            <w:r>
+              <w:rPr>
+                <w:rFonts w:ascii="Trebuchet MS" w:hAnsi="Trebuchet MS" w:cs="Arial"/>
+                <w:i/>
+                <w:sz w:val="24"/>
+                <w:szCs w:val="24"/>
+                <w:lang w:eastAsia="tr-TR" w:bidi="tr-TR"/>
+              </w:rPr>
+              <w:t xml:space="preserve"> eklenmesi gerekmektedir.</w:t>
+            </w:r>
+            <w:r>
+              <w:rPr>
+                <w:rFonts w:ascii="Trebuchet MS" w:hAnsi="Trebuchet MS" w:cs="Arial"/>
+                <w:i/>
+                <w:sz w:val="24"/>
+                <w:szCs w:val="24"/>
+                <w:lang w:eastAsia="tr-TR" w:bidi="tr-TR"/>
+              </w:rPr>
+              <w:t xml:space="preserve"> Bir önceki maddede belirtilen 100 k</w:t>
+            </w:r>
+            <w:r>
+              <w:rPr>
+                <w:rFonts w:ascii="Trebuchet MS" w:hAnsi="Trebuchet MS" w:cs="Arial"/>
+                <w:i/>
+                <w:sz w:val="24"/>
+                <w:szCs w:val="24"/>
+                <w:lang w:eastAsia="tr-TR" w:bidi="tr-TR"/>
+              </w:rPr>
+              <w:t>elime</w:t>
+            </w:r>
+            <w:r>
+              <w:rPr>
+                <w:rFonts w:ascii="Trebuchet MS" w:hAnsi="Trebuchet MS" w:cs="Arial"/>
+                <w:i/>
+                <w:sz w:val="24"/>
+                <w:szCs w:val="24"/>
+                <w:lang w:eastAsia="tr-TR" w:bidi="tr-TR"/>
+              </w:rPr>
+              <w:t xml:space="preserve"> sınırı, </w:t>
+            </w:r>
+            <w:r>
+              <w:rPr>
+                <w:rFonts w:ascii="Trebuchet MS" w:hAnsi="Trebuchet MS" w:cs="Arial"/>
+                <w:b/>
+                <w:bCs/>
+                <w:i/>
+                <w:sz w:val="24"/>
+                <w:szCs w:val="24"/>
+                <w:u w:val="single"/>
+                <w:lang w:eastAsia="tr-TR" w:bidi="tr-TR"/>
+              </w:rPr>
+              <w:t>bu maddeye dahil değildir.</w:t>
+            </w:r>
+          </w:p>
+          <w:p>
+            <w:pPr>
+              <w:pStyle w:val="ListeParagraf"/>
+              <w:numPr>
+                <w:ilvl w:val="0"/>
+                <w:numId w:val="48"/>
+              </w:numPr>
+              <w:spacing w:line="276" w:lineRule="auto"/>
+              <w:jc w:val="both"/>
+              <w:rPr>
+                <w:rFonts w:ascii="Trebuchet MS" w:hAnsi="Trebuchet MS" w:cs="Arial"/>
+                <w:i/>
+                <w:sz w:val="24"/>
+                <w:szCs w:val="24"/>
+                <w:lang w:eastAsia="tr-TR" w:bidi="tr-TR"/>
+              </w:rPr>
+            </w:pPr>
+            <w:r>
+              <w:rPr>
+                <w:rFonts w:ascii="Trebuchet MS" w:hAnsi="Trebuchet MS" w:cs="Arial"/>
+                <w:i/>
+                <w:sz w:val="24"/>
+                <w:szCs w:val="24"/>
+                <w:lang w:eastAsia="tr-TR" w:bidi="tr-TR"/>
+              </w:rPr>
+              <w:t xml:space="preserve">Bu bölüme eklenecek bilgilerin takım üyeleri hakkında </w:t>
+            </w:r>
+            <w:r>
+              <w:rPr>
+                <w:rFonts w:ascii="Trebuchet MS" w:hAnsi="Trebuchet MS" w:cs="Arial"/>
+                <w:b/>
+                <w:i/>
+                <w:sz w:val="24"/>
+                <w:szCs w:val="24"/>
+                <w:u w:val="single"/>
+                <w:lang w:eastAsia="tr-TR" w:bidi="tr-TR"/>
+              </w:rPr>
+              <w:t>kişisel veri (isim-</w:t>
             </w:r>
             <w:proofErr w:type="spellStart"/>
             <w:r>
               <w:rPr>
                 <w:rFonts w:ascii="Trebuchet MS" w:hAnsi="Trebuchet MS" w:cs="Arial"/>
-                <w:sz w:val="24"/>
-                <w:szCs w:val="24"/>
-                <w:lang w:val="en-US" w:eastAsia="tr-TR" w:bidi="tr-TR"/>
-              </w:rPr>
-              <w:t>eneyap</w:t>
+                <w:b/>
+                <w:i/>
+                <w:sz w:val="24"/>
+                <w:szCs w:val="24"/>
+                <w:u w:val="single"/>
+                <w:lang w:eastAsia="tr-TR" w:bidi="tr-TR"/>
+              </w:rPr>
+              <w:t>soy</w:t>
+            </w:r>
+            <w:r>
+              <w:rPr>
+                <w:rFonts w:ascii="Trebuchet MS" w:hAnsi="Trebuchet MS" w:cs="Arial"/>
+                <w:b/>
+                <w:i/>
+                <w:sz w:val="24"/>
+                <w:szCs w:val="24"/>
+                <w:u w:val="single"/>
+                <w:lang w:eastAsia="tr-TR" w:bidi="tr-TR"/>
+              </w:rPr>
+              <w:t>ad</w:t>
             </w:r>
             <w:proofErr w:type="spellEnd"/>
             <w:r>
               <w:rPr>
                 <w:rFonts w:ascii="Trebuchet MS" w:hAnsi="Trebuchet MS" w:cs="Arial"/>
-                <w:sz w:val="24"/>
-                <w:szCs w:val="24"/>
-                <w:lang w:val="en-US" w:eastAsia="tr-TR" w:bidi="tr-TR"/>
-              </w:rPr>
-              <w:t xml:space="preserve"> </w:t>
+                <w:b/>
+                <w:i/>
+                <w:sz w:val="24"/>
+                <w:szCs w:val="24"/>
+                <w:u w:val="single"/>
+                <w:lang w:eastAsia="tr-TR" w:bidi="tr-TR"/>
+              </w:rPr>
+              <w:t>, T</w:t>
             </w:r>
-            <w:proofErr w:type="spellStart"/>
             <w:r>
               <w:rPr>
                 <w:rFonts w:ascii="Trebuchet MS" w:hAnsi="Trebuchet MS" w:cs="Arial"/>
-                <w:sz w:val="24"/>
-                <w:szCs w:val="24"/>
-                <w:lang w:val="en-US" w:eastAsia="tr-TR" w:bidi="tr-TR"/>
-              </w:rPr>
-              <w:t>bünyesinde</w:t>
-            </w:r>
-            <w:proofErr w:type="spellEnd"/>
-            <w:r>
-              <w:rPr>
-                <w:rFonts w:ascii="Trebuchet MS" w:hAnsi="Trebuchet MS" w:cs="Arial"/>
-                <w:sz w:val="24"/>
-                <w:szCs w:val="24"/>
-                <w:lang w:val="en-US" w:eastAsia="tr-TR" w:bidi="tr-TR"/>
-              </w:rPr>
-              <w:t xml:space="preserve"> TEKNOFEST </w:t>
-            </w:r>
-            <w:proofErr w:type="spellStart"/>
-            <w:r>
-              <w:rPr>
-                <w:rFonts w:ascii="Trebuchet MS" w:hAnsi="Trebuchet MS" w:cs="Arial"/>
-                <w:sz w:val="24"/>
-                <w:szCs w:val="24"/>
-                <w:lang w:val="en-US" w:eastAsia="tr-TR" w:bidi="tr-TR"/>
-              </w:rPr>
-              <w:t>Sanayide</w:t>
-            </w:r>
-            <w:proofErr w:type="spellEnd"/>
-            <w:r>
-              <w:rPr>
-                <w:rFonts w:ascii="Trebuchet MS" w:hAnsi="Trebuchet MS" w:cs="Arial"/>
-                <w:sz w:val="24"/>
-                <w:szCs w:val="24"/>
-                <w:lang w:val="en-US" w:eastAsia="tr-TR" w:bidi="tr-TR"/>
-              </w:rPr>
-              <w:t xml:space="preserve"> </w:t>
-            </w:r>
-            <w:proofErr w:type="spellStart"/>
-            <w:r>
-              <w:rPr>
-                <w:rFonts w:ascii="Trebuchet MS" w:hAnsi="Trebuchet MS" w:cs="Arial"/>
-                <w:sz w:val="24"/>
-                <w:szCs w:val="24"/>
-                <w:lang w:val="en-US" w:eastAsia="tr-TR" w:bidi="tr-TR"/>
-              </w:rPr>
-              <w:t>Robotik</w:t>
-            </w:r>
-            <w:proofErr w:type="spellEnd"/>
-            <w:r>
-              <w:rPr>
-                <w:rFonts w:ascii="Trebuchet MS" w:hAnsi="Trebuchet MS" w:cs="Arial"/>
-                <w:sz w:val="24"/>
-                <w:szCs w:val="24"/>
-                <w:lang w:val="en-US" w:eastAsia="tr-TR" w:bidi="tr-TR"/>
-              </w:rPr>
-              <w:t xml:space="preserve"> </w:t>
-            </w:r>
-            <w:proofErr w:type="spellStart"/>
-            <w:r>
-              <w:rPr>
-                <w:rFonts w:ascii="Trebuchet MS" w:hAnsi="Trebuchet MS" w:cs="Arial"/>
-                <w:sz w:val="24"/>
-                <w:szCs w:val="24"/>
-                <w:lang w:val="en-US" w:eastAsia="tr-TR" w:bidi="tr-TR"/>
-              </w:rPr>
-              <w:t>Uygulamalar</w:t>
-            </w:r>
-            <w:proofErr w:type="spellEnd"/>
-            <w:r>
-              <w:rPr>
-                <w:rFonts w:ascii="Trebuchet MS" w:hAnsi="Trebuchet MS" w:cs="Arial"/>
-                <w:sz w:val="24"/>
-                <w:szCs w:val="24"/>
-                <w:lang w:val="en-US" w:eastAsia="tr-TR" w:bidi="tr-TR"/>
-              </w:rPr>
-              <w:t xml:space="preserve"> </w:t>
-            </w:r>
-            <w:proofErr w:type="spellStart"/>
-            <w:r>
-              <w:rPr>
-                <w:rFonts w:ascii="Trebuchet MS" w:hAnsi="Trebuchet MS" w:cs="Arial"/>
-                <w:sz w:val="24"/>
-                <w:szCs w:val="24"/>
-                <w:lang w:val="en-US" w:eastAsia="tr-TR" w:bidi="tr-TR"/>
-              </w:rPr>
-              <w:t>Yarışması</w:t>
-            </w:r>
-            <w:proofErr w:type="spellEnd"/>
-            <w:r>
-              <w:rPr>
-                <w:rFonts w:ascii="Trebuchet MS" w:hAnsi="Trebuchet MS" w:cs="Arial"/>
-                <w:sz w:val="24"/>
-                <w:szCs w:val="24"/>
-                <w:lang w:val="en-US" w:eastAsia="tr-TR" w:bidi="tr-TR"/>
-              </w:rPr>
-              <w:t xml:space="preserve"> </w:t>
-            </w:r>
-            <w:proofErr w:type="spellStart"/>
-            <w:r>
-              <w:rPr>
-                <w:rFonts w:ascii="Trebuchet MS" w:hAnsi="Trebuchet MS" w:cs="Arial"/>
-                <w:sz w:val="24"/>
-                <w:szCs w:val="24"/>
-                <w:lang w:val="en-US" w:eastAsia="tr-TR" w:bidi="tr-TR"/>
-              </w:rPr>
-              <w:t>için</w:t>
-            </w:r>
-            <w:proofErr w:type="spellEnd"/>
-            <w:r>
-              <w:rPr>
-                <w:rFonts w:ascii="Trebuchet MS" w:hAnsi="Trebuchet MS" w:cs="Arial"/>
-                <w:sz w:val="24"/>
-                <w:szCs w:val="24"/>
-                <w:lang w:val="en-US" w:eastAsia="tr-TR" w:bidi="tr-TR"/>
-              </w:rPr>
-              <w:t xml:space="preserve"> </w:t>
-            </w:r>
-            <w:proofErr w:type="spellStart"/>
-            <w:r>
-              <w:rPr>
-                <w:rFonts w:ascii="Trebuchet MS" w:hAnsi="Trebuchet MS" w:cs="Arial"/>
-                <w:sz w:val="24"/>
-                <w:szCs w:val="24"/>
-                <w:lang w:val="en-US" w:eastAsia="tr-TR" w:bidi="tr-TR"/>
-              </w:rPr>
-              <w:t>oluşturulmuş</w:t>
-            </w:r>
-            <w:proofErr w:type="spellEnd"/>
-            <w:r>
-              <w:rPr>
-                <w:rFonts w:ascii="Trebuchet MS" w:hAnsi="Trebuchet MS" w:cs="Arial"/>
-                <w:sz w:val="24"/>
-                <w:szCs w:val="24"/>
-                <w:lang w:val="en-US" w:eastAsia="tr-TR" w:bidi="tr-TR"/>
-              </w:rPr>
-              <w:t xml:space="preserve"> </w:t>
-            </w:r>
-            <w:proofErr w:type="spellStart"/>
-            <w:r>
-              <w:rPr>
-                <w:rFonts w:ascii="Trebuchet MS" w:hAnsi="Trebuchet MS" w:cs="Arial"/>
-                <w:sz w:val="24"/>
-                <w:szCs w:val="24"/>
-                <w:lang w:val="en-US" w:eastAsia="tr-TR" w:bidi="tr-TR"/>
-              </w:rPr>
-              <w:t>lise</w:t>
-            </w:r>
-            <w:proofErr w:type="spellEnd"/>
-            <w:r>
-              <w:rPr>
-                <w:rFonts w:ascii="Trebuchet MS" w:hAnsi="Trebuchet MS" w:cs="Arial"/>
-                <w:sz w:val="24"/>
-                <w:szCs w:val="24"/>
-                <w:lang w:val="en-US" w:eastAsia="tr-TR" w:bidi="tr-TR"/>
-              </w:rPr>
-              <w:t xml:space="preserve"> </w:t>
-            </w:r>
-            <w:proofErr w:type="spellStart"/>
-            <w:r>
-              <w:rPr>
-                <w:rFonts w:ascii="Trebuchet MS" w:hAnsi="Trebuchet MS" w:cs="Arial"/>
-                <w:sz w:val="24"/>
-                <w:szCs w:val="24"/>
-                <w:lang w:val="en-US" w:eastAsia="tr-TR" w:bidi="tr-TR"/>
-              </w:rPr>
-              <w:t>düzeyinde</w:t>
-            </w:r>
-            <w:proofErr w:type="spellEnd"/>
-            <w:r>
-              <w:rPr>
-                <w:rFonts w:ascii="Trebuchet MS" w:hAnsi="Trebuchet MS" w:cs="Arial"/>
-                <w:sz w:val="24"/>
-                <w:szCs w:val="24"/>
-                <w:lang w:val="en-US" w:eastAsia="tr-TR" w:bidi="tr-TR"/>
-              </w:rPr>
-              <w:t xml:space="preserve"> </w:t>
-            </w:r>
-            <w:proofErr w:type="spellStart"/>
-            <w:r>
-              <w:rPr>
-                <w:rFonts w:ascii="Trebuchet MS" w:hAnsi="Trebuchet MS" w:cs="Arial"/>
-                <w:sz w:val="24"/>
-                <w:szCs w:val="24"/>
-                <w:lang w:val="en-US" w:eastAsia="tr-TR" w:bidi="tr-TR"/>
-              </w:rPr>
-              <w:t>bir</w:t>
-            </w:r>
-            <w:proofErr w:type="spellEnd"/>
-            <w:r>
-              <w:rPr>
-                <w:rFonts w:ascii="Trebuchet MS" w:hAnsi="Trebuchet MS" w:cs="Arial"/>
-                <w:sz w:val="24"/>
-                <w:szCs w:val="24"/>
-                <w:lang w:val="en-US" w:eastAsia="tr-TR" w:bidi="tr-TR"/>
-              </w:rPr>
-              <w:t xml:space="preserve"> </w:t>
-            </w:r>
-            <w:proofErr w:type="spellStart"/>
-            <w:r>
-              <w:rPr>
-                <w:rFonts w:ascii="Trebuchet MS" w:hAnsi="Trebuchet MS" w:cs="Arial"/>
-                <w:sz w:val="24"/>
-                <w:szCs w:val="24"/>
-                <w:lang w:val="en-US" w:eastAsia="tr-TR" w:bidi="tr-TR"/>
-              </w:rPr>
-              <w:t>robotik</w:t>
-            </w:r>
-            <w:proofErr w:type="spellEnd"/>
-            <w:r>
-              <w:rPr>
-                <w:rFonts w:ascii="Trebuchet MS" w:hAnsi="Trebuchet MS" w:cs="Arial"/>
-                <w:sz w:val="24"/>
-                <w:szCs w:val="24"/>
-                <w:lang w:val="en-US" w:eastAsia="tr-TR" w:bidi="tr-TR"/>
-              </w:rPr>
-              <w:t xml:space="preserve"> </w:t>
-            </w:r>
-            <w:proofErr w:type="spellStart"/>
-            <w:r>
-              <w:rPr>
-                <w:rFonts w:ascii="Trebuchet MS" w:hAnsi="Trebuchet MS" w:cs="Arial"/>
-                <w:sz w:val="24"/>
-                <w:szCs w:val="24"/>
-                <w:lang w:val="en-US" w:eastAsia="tr-TR" w:bidi="tr-TR"/>
-              </w:rPr>
-              <w:t>takımıdır</w:t>
-            </w:r>
-            <w:proofErr w:type="spellEnd"/>
-            <w:r>
-              <w:rPr>
-                <w:rFonts w:ascii="Trebuchet MS" w:hAnsi="Trebuchet MS" w:cs="Arial"/>
-                <w:sz w:val="24"/>
-                <w:szCs w:val="24"/>
-                <w:lang w:val="en-US" w:eastAsia="tr-TR" w:bidi="tr-TR"/>
-              </w:rPr>
-              <w:t xml:space="preserve">. </w:t>
-            </w:r>
-            <w:proofErr w:type="spellStart"/>
-            <w:r>
-              <w:rPr>
-                <w:rFonts w:ascii="Trebuchet MS" w:hAnsi="Trebuchet MS" w:cs="Arial"/>
-                <w:sz w:val="24"/>
-                <w:szCs w:val="24"/>
-                <w:lang w:val="en-US" w:eastAsia="tr-TR" w:bidi="tr-TR"/>
-              </w:rPr>
-              <w:t>Takımda</w:t>
-            </w:r>
-            <w:proofErr w:type="spellEnd"/>
-            <w:r>
-              <w:rPr>
-                <w:rFonts w:ascii="Trebuchet MS" w:hAnsi="Trebuchet MS" w:cs="Arial"/>
-                <w:sz w:val="24"/>
-                <w:szCs w:val="24"/>
-                <w:lang w:val="en-US" w:eastAsia="tr-TR" w:bidi="tr-TR"/>
-              </w:rPr>
-              <w:t xml:space="preserve"> </w:t>
-            </w:r>
-            <w:proofErr w:type="spellStart"/>
-            <w:r>
-              <w:rPr>
-                <w:rFonts w:ascii="Trebuchet MS" w:hAnsi="Trebuchet MS" w:cs="Arial"/>
-                <w:sz w:val="24"/>
-                <w:szCs w:val="24"/>
-                <w:lang w:val="en-US" w:eastAsia="tr-TR" w:bidi="tr-TR"/>
-              </w:rPr>
-              <w:t>görevler</w:t>
-            </w:r>
-            <w:proofErr w:type="spellEnd"/>
-            <w:r>
-              <w:rPr>
-                <w:rFonts w:ascii="Trebuchet MS" w:hAnsi="Trebuchet MS" w:cs="Arial"/>
-                <w:sz w:val="24"/>
-                <w:szCs w:val="24"/>
-                <w:lang w:val="en-US" w:eastAsia="tr-TR" w:bidi="tr-TR"/>
-              </w:rPr>
-              <w:t xml:space="preserve">; </w:t>
-            </w:r>
-            <w:proofErr w:type="spellStart"/>
-            <w:r>
-              <w:rPr>
-                <w:rFonts w:ascii="Trebuchet MS" w:hAnsi="Trebuchet MS" w:cs="Arial"/>
-                <w:sz w:val="24"/>
-                <w:szCs w:val="24"/>
-                <w:lang w:val="en-US" w:eastAsia="tr-TR" w:bidi="tr-TR"/>
-              </w:rPr>
-              <w:t>mekanik</w:t>
-            </w:r>
-            <w:proofErr w:type="spellEnd"/>
-            <w:r>
-              <w:rPr>
-                <w:rFonts w:ascii="Trebuchet MS" w:hAnsi="Trebuchet MS" w:cs="Arial"/>
-                <w:sz w:val="24"/>
-                <w:szCs w:val="24"/>
-                <w:lang w:val="en-US" w:eastAsia="tr-TR" w:bidi="tr-TR"/>
-              </w:rPr>
-              <w:t xml:space="preserve">, </w:t>
-            </w:r>
-            <w:proofErr w:type="spellStart"/>
-            <w:r>
-              <w:rPr>
-                <w:rFonts w:ascii="Trebuchet MS" w:hAnsi="Trebuchet MS" w:cs="Arial"/>
-                <w:sz w:val="24"/>
-                <w:szCs w:val="24"/>
-                <w:lang w:val="en-US" w:eastAsia="tr-TR" w:bidi="tr-TR"/>
-              </w:rPr>
-              <w:t>elektronik</w:t>
-            </w:r>
-            <w:proofErr w:type="spellEnd"/>
-            <w:r>
-              <w:rPr>
-                <w:rFonts w:ascii="Trebuchet MS" w:hAnsi="Trebuchet MS" w:cs="Arial"/>
-                <w:sz w:val="24"/>
-                <w:szCs w:val="24"/>
-                <w:lang w:val="en-US" w:eastAsia="tr-TR" w:bidi="tr-TR"/>
-              </w:rPr>
-              <w:t xml:space="preserve">, </w:t>
-            </w:r>
-            <w:proofErr w:type="spellStart"/>
-            <w:r>
-              <w:rPr>
-                <w:rFonts w:ascii="Trebuchet MS" w:hAnsi="Trebuchet MS" w:cs="Arial"/>
-                <w:sz w:val="24"/>
-                <w:szCs w:val="24"/>
-                <w:lang w:val="en-US" w:eastAsia="tr-TR" w:bidi="tr-TR"/>
-              </w:rPr>
-              <w:t>algoritmalar-yazılım</w:t>
-            </w:r>
-            <w:proofErr w:type="spellEnd"/>
-            <w:r>
-              <w:rPr>
-                <w:rFonts w:ascii="Trebuchet MS" w:hAnsi="Trebuchet MS" w:cs="Arial"/>
-                <w:sz w:val="24"/>
-                <w:szCs w:val="24"/>
-                <w:lang w:val="en-US" w:eastAsia="tr-TR" w:bidi="tr-TR"/>
-              </w:rPr>
-              <w:t xml:space="preserve">, robot </w:t>
-            </w:r>
-            <w:proofErr w:type="spellStart"/>
-            <w:r>
-              <w:rPr>
-                <w:rFonts w:ascii="Trebuchet MS" w:hAnsi="Trebuchet MS" w:cs="Arial"/>
-                <w:sz w:val="24"/>
-                <w:szCs w:val="24"/>
-                <w:lang w:val="en-US" w:eastAsia="tr-TR" w:bidi="tr-TR"/>
-              </w:rPr>
-              <w:t>üst</w:t>
-            </w:r>
-            <w:proofErr w:type="spellEnd"/>
-            <w:r>
-              <w:rPr>
-                <w:rFonts w:ascii="Trebuchet MS" w:hAnsi="Trebuchet MS" w:cs="Arial"/>
-                <w:sz w:val="24"/>
-                <w:szCs w:val="24"/>
-                <w:lang w:val="en-US" w:eastAsia="tr-TR" w:bidi="tr-TR"/>
-              </w:rPr>
-              <w:t xml:space="preserve"> </w:t>
-            </w:r>
-            <w:proofErr w:type="spellStart"/>
-            <w:r>
-              <w:rPr>
-                <w:rFonts w:ascii="Trebuchet MS" w:hAnsi="Trebuchet MS" w:cs="Arial"/>
-                <w:sz w:val="24"/>
-                <w:szCs w:val="24"/>
-                <w:lang w:val="en-US" w:eastAsia="tr-TR" w:bidi="tr-TR"/>
-              </w:rPr>
-              <w:t>yapı</w:t>
-            </w:r>
-            <w:proofErr w:type="spellEnd"/>
-            <w:r>
-              <w:rPr>
-                <w:rFonts w:ascii="Trebuchet MS" w:hAnsi="Trebuchet MS" w:cs="Arial"/>
-                <w:sz w:val="24"/>
-                <w:szCs w:val="24"/>
-                <w:lang w:val="en-US" w:eastAsia="tr-TR" w:bidi="tr-TR"/>
-              </w:rPr>
-              <w:t xml:space="preserve">, </w:t>
-            </w:r>
-            <w:proofErr w:type="spellStart"/>
-            <w:r>
-              <w:rPr>
-                <w:rFonts w:ascii="Trebuchet MS" w:hAnsi="Trebuchet MS" w:cs="Arial"/>
-                <w:sz w:val="24"/>
-                <w:szCs w:val="24"/>
-                <w:lang w:val="en-US" w:eastAsia="tr-TR" w:bidi="tr-TR"/>
-              </w:rPr>
-              <w:t>araç</w:t>
-            </w:r>
-            <w:proofErr w:type="spellEnd"/>
-            <w:r>
-              <w:rPr>
-                <w:rFonts w:ascii="Trebuchet MS" w:hAnsi="Trebuchet MS" w:cs="Arial"/>
-                <w:sz w:val="24"/>
-                <w:szCs w:val="24"/>
-                <w:lang w:val="en-US" w:eastAsia="tr-TR" w:bidi="tr-TR"/>
-              </w:rPr>
-              <w:t xml:space="preserve"> </w:t>
-            </w:r>
-            <w:proofErr w:type="spellStart"/>
-            <w:r>
-              <w:rPr>
-                <w:rFonts w:ascii="Trebuchet MS" w:hAnsi="Trebuchet MS" w:cs="Arial"/>
-                <w:sz w:val="24"/>
-                <w:szCs w:val="24"/>
-                <w:lang w:val="en-US" w:eastAsia="tr-TR" w:bidi="tr-TR"/>
-              </w:rPr>
-              <w:t>tasarımı</w:t>
-            </w:r>
-            <w:proofErr w:type="spellEnd"/>
-            <w:r>
-              <w:rPr>
-                <w:rFonts w:ascii="Trebuchet MS" w:hAnsi="Trebuchet MS" w:cs="Arial"/>
-                <w:sz w:val="24"/>
-                <w:szCs w:val="24"/>
-                <w:lang w:val="en-US" w:eastAsia="tr-TR" w:bidi="tr-TR"/>
-              </w:rPr>
-              <w:t xml:space="preserve"> ve </w:t>
-            </w:r>
-            <w:proofErr w:type="spellStart"/>
-            <w:r>
-              <w:rPr>
-                <w:rFonts w:ascii="Trebuchet MS" w:hAnsi="Trebuchet MS" w:cs="Arial"/>
-                <w:sz w:val="24"/>
-                <w:szCs w:val="24"/>
-                <w:lang w:val="en-US" w:eastAsia="tr-TR" w:bidi="tr-TR"/>
-              </w:rPr>
-              <w:t>rapor</w:t>
-            </w:r>
-            <w:proofErr w:type="spellEnd"/>
-            <w:r>
-              <w:rPr>
-                <w:rFonts w:ascii="Trebuchet MS" w:hAnsi="Trebuchet MS" w:cs="Arial"/>
-                <w:sz w:val="24"/>
-                <w:szCs w:val="24"/>
-                <w:lang w:val="en-US" w:eastAsia="tr-TR" w:bidi="tr-TR"/>
-              </w:rPr>
-              <w:t xml:space="preserve"> </w:t>
-            </w:r>
-            <w:proofErr w:type="spellStart"/>
-            <w:r>
-              <w:rPr>
-                <w:rFonts w:ascii="Trebuchet MS" w:hAnsi="Trebuchet MS" w:cs="Arial"/>
-                <w:sz w:val="24"/>
-                <w:szCs w:val="24"/>
-                <w:lang w:val="en-US" w:eastAsia="tr-TR" w:bidi="tr-TR"/>
-              </w:rPr>
-              <w:t>düzenleme</w:t>
-            </w:r>
-            <w:proofErr w:type="spellEnd"/>
-            <w:r>
-              <w:rPr>
-                <w:rFonts w:ascii="Trebuchet MS" w:hAnsi="Trebuchet MS" w:cs="Arial"/>
-                <w:sz w:val="24"/>
-                <w:szCs w:val="24"/>
-                <w:lang w:val="en-US" w:eastAsia="tr-TR" w:bidi="tr-TR"/>
-              </w:rPr>
-              <w:t xml:space="preserve"> </w:t>
-            </w:r>
-            <w:proofErr w:type="spellStart"/>
-            <w:r>
-              <w:rPr>
-                <w:rFonts w:ascii="Trebuchet MS" w:hAnsi="Trebuchet MS" w:cs="Arial"/>
-                <w:sz w:val="24"/>
-                <w:szCs w:val="24"/>
-                <w:lang w:val="en-US" w:eastAsia="tr-TR" w:bidi="tr-TR"/>
-              </w:rPr>
-              <w:t>alanlarına</w:t>
-            </w:r>
-            <w:proofErr w:type="spellEnd"/>
-            <w:r>
-              <w:rPr>
-                <w:rFonts w:ascii="Trebuchet MS" w:hAnsi="Trebuchet MS" w:cs="Arial"/>
-                <w:sz w:val="24"/>
-                <w:szCs w:val="24"/>
-                <w:lang w:val="en-US" w:eastAsia="tr-TR" w:bidi="tr-TR"/>
-              </w:rPr>
-              <w:t xml:space="preserve"> </w:t>
-            </w:r>
-            <w:proofErr w:type="spellStart"/>
-            <w:r>
-              <w:rPr>
-                <w:rFonts w:ascii="Trebuchet MS" w:hAnsi="Trebuchet MS" w:cs="Arial"/>
-                <w:sz w:val="24"/>
-                <w:szCs w:val="24"/>
-                <w:lang w:val="en-US" w:eastAsia="tr-TR" w:bidi="tr-TR"/>
-              </w:rPr>
-              <w:t>ayrılmıştır</w:t>
-            </w:r>
-            <w:proofErr w:type="spellEnd"/>
-            <w:r>
-              <w:rPr>
-                <w:rFonts w:ascii="Trebuchet MS" w:hAnsi="Trebuchet MS" w:cs="Arial"/>
-                <w:sz w:val="24"/>
-                <w:szCs w:val="24"/>
-                <w:lang w:val="en-US" w:eastAsia="tr-TR" w:bidi="tr-TR"/>
-              </w:rPr>
-              <w:t xml:space="preserve">. </w:t>
-            </w:r>
-            <w:proofErr w:type="spellStart"/>
-            <w:r>
-              <w:rPr>
-                <w:rFonts w:ascii="Trebuchet MS" w:hAnsi="Trebuchet MS" w:cs="Arial"/>
-                <w:sz w:val="24"/>
-                <w:szCs w:val="24"/>
-                <w:lang w:val="en-US" w:eastAsia="tr-TR" w:bidi="tr-TR"/>
-              </w:rPr>
-              <w:t>Projede</w:t>
-            </w:r>
-            <w:proofErr w:type="spellEnd"/>
-            <w:r>
-              <w:rPr>
-                <w:rFonts w:ascii="Trebuchet MS" w:hAnsi="Trebuchet MS" w:cs="Arial"/>
-                <w:sz w:val="24"/>
-                <w:szCs w:val="24"/>
-                <w:lang w:val="en-US" w:eastAsia="tr-TR" w:bidi="tr-TR"/>
-              </w:rPr>
-              <w:t xml:space="preserve">, </w:t>
-            </w:r>
-            <w:proofErr w:type="spellStart"/>
-            <w:r>
-              <w:rPr>
-                <w:rFonts w:ascii="Trebuchet MS" w:hAnsi="Trebuchet MS" w:cs="Arial"/>
-                <w:sz w:val="24"/>
-                <w:szCs w:val="24"/>
-                <w:lang w:val="en-US" w:eastAsia="tr-TR" w:bidi="tr-TR"/>
-              </w:rPr>
-              <w:t>fabrika</w:t>
-            </w:r>
-            <w:proofErr w:type="spellEnd"/>
-            <w:r>
-              <w:rPr>
-                <w:rFonts w:ascii="Trebuchet MS" w:hAnsi="Trebuchet MS" w:cs="Arial"/>
-                <w:sz w:val="24"/>
-                <w:szCs w:val="24"/>
-                <w:lang w:val="en-US" w:eastAsia="tr-TR" w:bidi="tr-TR"/>
-              </w:rPr>
-              <w:t xml:space="preserve"> </w:t>
-            </w:r>
-            <w:proofErr w:type="spellStart"/>
-            <w:r>
-              <w:rPr>
-                <w:rFonts w:ascii="Trebuchet MS" w:hAnsi="Trebuchet MS" w:cs="Arial"/>
-                <w:sz w:val="24"/>
-                <w:szCs w:val="24"/>
-                <w:lang w:val="en-US" w:eastAsia="tr-TR" w:bidi="tr-TR"/>
-              </w:rPr>
-              <w:t>içi</w:t>
-            </w:r>
-            <w:proofErr w:type="spellEnd"/>
-            <w:r>
-              <w:rPr>
-                <w:rFonts w:ascii="Trebuchet MS" w:hAnsi="Trebuchet MS" w:cs="Arial"/>
-                <w:sz w:val="24"/>
-                <w:szCs w:val="24"/>
-                <w:lang w:val="en-US" w:eastAsia="tr-TR" w:bidi="tr-TR"/>
-              </w:rPr>
-              <w:t xml:space="preserve"> </w:t>
-            </w:r>
-            <w:proofErr w:type="spellStart"/>
-            <w:r>
-              <w:rPr>
-                <w:rFonts w:ascii="Trebuchet MS" w:hAnsi="Trebuchet MS" w:cs="Arial"/>
-                <w:sz w:val="24"/>
-                <w:szCs w:val="24"/>
-                <w:lang w:val="en-US" w:eastAsia="tr-TR" w:bidi="tr-TR"/>
-              </w:rPr>
-              <w:t>yük</w:t>
-            </w:r>
-            <w:proofErr w:type="spellEnd"/>
-            <w:r>
-              <w:rPr>
-                <w:rFonts w:ascii="Trebuchet MS" w:hAnsi="Trebuchet MS" w:cs="Arial"/>
-                <w:sz w:val="24"/>
-                <w:szCs w:val="24"/>
-                <w:lang w:val="en-US" w:eastAsia="tr-TR" w:bidi="tr-TR"/>
-              </w:rPr>
-              <w:t xml:space="preserve"> </w:t>
-            </w:r>
-            <w:proofErr w:type="spellStart"/>
-            <w:r>
-              <w:rPr>
-                <w:rFonts w:ascii="Trebuchet MS" w:hAnsi="Trebuchet MS" w:cs="Arial"/>
-                <w:sz w:val="24"/>
-                <w:szCs w:val="24"/>
-                <w:lang w:val="en-US" w:eastAsia="tr-TR" w:bidi="tr-TR"/>
-              </w:rPr>
-              <w:t>taşıma</w:t>
-            </w:r>
-            <w:proofErr w:type="spellEnd"/>
-            <w:r>
-              <w:rPr>
-                <w:rFonts w:ascii="Trebuchet MS" w:hAnsi="Trebuchet MS" w:cs="Arial"/>
-                <w:sz w:val="24"/>
-                <w:szCs w:val="24"/>
-                <w:lang w:val="en-US" w:eastAsia="tr-TR" w:bidi="tr-TR"/>
-              </w:rPr>
-              <w:t xml:space="preserve"> </w:t>
-            </w:r>
-            <w:proofErr w:type="spellStart"/>
-            <w:r>
-              <w:rPr>
-                <w:rFonts w:ascii="Trebuchet MS" w:hAnsi="Trebuchet MS" w:cs="Arial"/>
-                <w:sz w:val="24"/>
-                <w:szCs w:val="24"/>
-                <w:lang w:val="en-US" w:eastAsia="tr-TR" w:bidi="tr-TR"/>
-              </w:rPr>
-              <w:t>görevini</w:t>
-            </w:r>
-            <w:proofErr w:type="spellEnd"/>
-            <w:r>
-              <w:rPr>
-                <w:rFonts w:ascii="Trebuchet MS" w:hAnsi="Trebuchet MS" w:cs="Arial"/>
-                <w:sz w:val="24"/>
-                <w:szCs w:val="24"/>
-                <w:lang w:val="en-US" w:eastAsia="tr-TR" w:bidi="tr-TR"/>
-              </w:rPr>
-              <w:t xml:space="preserve"> </w:t>
-            </w:r>
-            <w:proofErr w:type="spellStart"/>
-            <w:r>
-              <w:rPr>
-                <w:rFonts w:ascii="Trebuchet MS" w:hAnsi="Trebuchet MS" w:cs="Arial"/>
-                <w:sz w:val="24"/>
-                <w:szCs w:val="24"/>
-                <w:lang w:val="en-US" w:eastAsia="tr-TR" w:bidi="tr-TR"/>
-              </w:rPr>
-              <w:t>yerine</w:t>
-            </w:r>
-            <w:proofErr w:type="spellEnd"/>
-            <w:r>
-              <w:rPr>
-                <w:rFonts w:ascii="Trebuchet MS" w:hAnsi="Trebuchet MS" w:cs="Arial"/>
-                <w:sz w:val="24"/>
-                <w:szCs w:val="24"/>
-                <w:lang w:val="en-US" w:eastAsia="tr-TR" w:bidi="tr-TR"/>
-              </w:rPr>
-              <w:t xml:space="preserve"> </w:t>
-            </w:r>
-            <w:proofErr w:type="spellStart"/>
-            <w:r>
-              <w:rPr>
-                <w:rFonts w:ascii="Trebuchet MS" w:hAnsi="Trebuchet MS" w:cs="Arial"/>
-                <w:sz w:val="24"/>
-                <w:szCs w:val="24"/>
-                <w:lang w:val="en-US" w:eastAsia="tr-TR" w:bidi="tr-TR"/>
-              </w:rPr>
-              <w:t>getirebilecek</w:t>
-            </w:r>
-            <w:proofErr w:type="spellEnd"/>
-            <w:r>
-              <w:rPr>
-                <w:rFonts w:ascii="Trebuchet MS" w:hAnsi="Trebuchet MS" w:cs="Arial"/>
-                <w:sz w:val="24"/>
-                <w:szCs w:val="24"/>
-                <w:lang w:val="en-US" w:eastAsia="tr-TR" w:bidi="tr-TR"/>
-              </w:rPr>
-              <w:t xml:space="preserve"> </w:t>
-            </w:r>
-            <w:proofErr w:type="spellStart"/>
-            <w:r>
-              <w:rPr>
-                <w:rFonts w:ascii="Trebuchet MS" w:hAnsi="Trebuchet MS" w:cs="Arial"/>
-                <w:sz w:val="24"/>
-                <w:szCs w:val="24"/>
-                <w:lang w:val="en-US" w:eastAsia="tr-TR" w:bidi="tr-TR"/>
-              </w:rPr>
-              <w:t>otonom</w:t>
-            </w:r>
-            <w:proofErr w:type="spellEnd"/>
-            <w:r>
-              <w:rPr>
-                <w:rFonts w:ascii="Trebuchet MS" w:hAnsi="Trebuchet MS" w:cs="Arial"/>
-                <w:sz w:val="24"/>
-                <w:szCs w:val="24"/>
-                <w:lang w:val="en-US" w:eastAsia="tr-TR" w:bidi="tr-TR"/>
-              </w:rPr>
-              <w:t xml:space="preserve"> </w:t>
-            </w:r>
-            <w:proofErr w:type="spellStart"/>
-            <w:r>
-              <w:rPr>
-                <w:rFonts w:ascii="Trebuchet MS" w:hAnsi="Trebuchet MS" w:cs="Arial"/>
-                <w:sz w:val="24"/>
-                <w:szCs w:val="24"/>
-                <w:lang w:val="en-US" w:eastAsia="tr-TR" w:bidi="tr-TR"/>
-              </w:rPr>
-              <w:t>bir</w:t>
-            </w:r>
-            <w:proofErr w:type="spellEnd"/>
-            <w:r>
-              <w:rPr>
-                <w:rFonts w:ascii="Trebuchet MS" w:hAnsi="Trebuchet MS" w:cs="Arial"/>
-                <w:sz w:val="24"/>
-                <w:szCs w:val="24"/>
-                <w:lang w:val="en-US" w:eastAsia="tr-TR" w:bidi="tr-TR"/>
-              </w:rPr>
-              <w:t xml:space="preserve"> forklift robot </w:t>
-            </w:r>
-            <w:proofErr w:type="spellStart"/>
-            <w:r>
-              <w:rPr>
-                <w:rFonts w:ascii="Trebuchet MS" w:hAnsi="Trebuchet MS" w:cs="Arial"/>
-                <w:sz w:val="24"/>
-                <w:szCs w:val="24"/>
-                <w:lang w:val="en-US" w:eastAsia="tr-TR" w:bidi="tr-TR"/>
-              </w:rPr>
-              <w:t>tasarlamak</w:t>
-            </w:r>
-            <w:proofErr w:type="spellEnd"/>
-            <w:r>
-              <w:rPr>
-                <w:rFonts w:ascii="Trebuchet MS" w:hAnsi="Trebuchet MS" w:cs="Arial"/>
-                <w:sz w:val="24"/>
-                <w:szCs w:val="24"/>
-                <w:lang w:val="en-US" w:eastAsia="tr-TR" w:bidi="tr-TR"/>
-              </w:rPr>
-              <w:t xml:space="preserve"> </w:t>
-            </w:r>
-            <w:proofErr w:type="spellStart"/>
-            <w:r>
-              <w:rPr>
-                <w:rFonts w:ascii="Trebuchet MS" w:hAnsi="Trebuchet MS" w:cs="Arial"/>
-                <w:sz w:val="24"/>
-                <w:szCs w:val="24"/>
-                <w:lang w:val="en-US" w:eastAsia="tr-TR" w:bidi="tr-TR"/>
-              </w:rPr>
-              <w:t>hedeflenmektedir</w:t>
-            </w:r>
-            <w:proofErr w:type="spellEnd"/>
-            <w:r>
-              <w:rPr>
-                <w:rFonts w:ascii="Trebuchet MS" w:hAnsi="Trebuchet MS" w:cs="Arial"/>
-                <w:sz w:val="24"/>
-                <w:szCs w:val="24"/>
-                <w:lang w:val="en-US" w:eastAsia="tr-TR" w:bidi="tr-TR"/>
-              </w:rPr>
-              <w:t xml:space="preserve">. </w:t>
-            </w:r>
-            <w:proofErr w:type="spellStart"/>
-            <w:r>
-              <w:rPr>
-                <w:rFonts w:ascii="Trebuchet MS" w:hAnsi="Trebuchet MS" w:cs="Arial"/>
-                <w:sz w:val="24"/>
-                <w:szCs w:val="24"/>
-                <w:lang w:val="en-US" w:eastAsia="tr-TR" w:bidi="tr-TR"/>
-              </w:rPr>
-              <w:t>Çalışma</w:t>
-            </w:r>
-            <w:proofErr w:type="spellEnd"/>
-            <w:r>
-              <w:rPr>
-                <w:rFonts w:ascii="Trebuchet MS" w:hAnsi="Trebuchet MS" w:cs="Arial"/>
-                <w:sz w:val="24"/>
-                <w:szCs w:val="24"/>
-                <w:lang w:val="en-US" w:eastAsia="tr-TR" w:bidi="tr-TR"/>
-              </w:rPr>
-              <w:t xml:space="preserve"> </w:t>
-            </w:r>
-            <w:proofErr w:type="spellStart"/>
-            <w:r>
-              <w:rPr>
-                <w:rFonts w:ascii="Trebuchet MS" w:hAnsi="Trebuchet MS" w:cs="Arial"/>
-                <w:sz w:val="24"/>
-                <w:szCs w:val="24"/>
-                <w:lang w:val="en-US" w:eastAsia="tr-TR" w:bidi="tr-TR"/>
-              </w:rPr>
-              <w:t>sürecinde</w:t>
-            </w:r>
-            <w:proofErr w:type="spellEnd"/>
-            <w:r>
-              <w:rPr>
-                <w:rFonts w:ascii="Trebuchet MS" w:hAnsi="Trebuchet MS" w:cs="Arial"/>
-                <w:sz w:val="24"/>
-                <w:szCs w:val="24"/>
-                <w:lang w:val="en-US" w:eastAsia="tr-TR" w:bidi="tr-TR"/>
-              </w:rPr>
-              <w:t xml:space="preserve"> </w:t>
-            </w:r>
-            <w:proofErr w:type="spellStart"/>
-            <w:r>
-              <w:rPr>
-                <w:rFonts w:ascii="Trebuchet MS" w:hAnsi="Trebuchet MS" w:cs="Arial"/>
-                <w:sz w:val="24"/>
-                <w:szCs w:val="24"/>
-                <w:lang w:val="en-US" w:eastAsia="tr-TR" w:bidi="tr-TR"/>
-              </w:rPr>
-              <w:t>üyeler</w:t>
-            </w:r>
-            <w:proofErr w:type="spellEnd"/>
-            <w:r>
-              <w:rPr>
-                <w:rFonts w:ascii="Trebuchet MS" w:hAnsi="Trebuchet MS" w:cs="Arial"/>
-                <w:sz w:val="24"/>
-                <w:szCs w:val="24"/>
-                <w:lang w:val="en-US" w:eastAsia="tr-TR" w:bidi="tr-TR"/>
-              </w:rPr>
-              <w:t xml:space="preserve"> </w:t>
-            </w:r>
-            <w:proofErr w:type="spellStart"/>
-            <w:r>
-              <w:rPr>
-                <w:rFonts w:ascii="Trebuchet MS" w:hAnsi="Trebuchet MS" w:cs="Arial"/>
-                <w:sz w:val="24"/>
-                <w:szCs w:val="24"/>
-                <w:lang w:val="en-US" w:eastAsia="tr-TR" w:bidi="tr-TR"/>
-              </w:rPr>
-              <w:t>kendi</w:t>
-            </w:r>
-            <w:proofErr w:type="spellEnd"/>
-            <w:r>
-              <w:rPr>
-                <w:rFonts w:ascii="Trebuchet MS" w:hAnsi="Trebuchet MS" w:cs="Arial"/>
-                <w:sz w:val="24"/>
-                <w:szCs w:val="24"/>
-                <w:lang w:val="en-US" w:eastAsia="tr-TR" w:bidi="tr-TR"/>
-              </w:rPr>
-              <w:t xml:space="preserve"> </w:t>
-            </w:r>
-            <w:proofErr w:type="spellStart"/>
-            <w:r>
-              <w:rPr>
-                <w:rFonts w:ascii="Trebuchet MS" w:hAnsi="Trebuchet MS" w:cs="Arial"/>
-                <w:sz w:val="24"/>
-                <w:szCs w:val="24"/>
-                <w:lang w:val="en-US" w:eastAsia="tr-TR" w:bidi="tr-TR"/>
-              </w:rPr>
-              <w:t>görev</w:t>
-            </w:r>
-            <w:proofErr w:type="spellEnd"/>
-            <w:r>
-              <w:rPr>
-                <w:rFonts w:ascii="Trebuchet MS" w:hAnsi="Trebuchet MS" w:cs="Arial"/>
-                <w:sz w:val="24"/>
-                <w:szCs w:val="24"/>
-                <w:lang w:val="en-US" w:eastAsia="tr-TR" w:bidi="tr-TR"/>
-              </w:rPr>
-              <w:t xml:space="preserve"> </w:t>
-            </w:r>
-            <w:proofErr w:type="spellStart"/>
-            <w:r>
-              <w:rPr>
-                <w:rFonts w:ascii="Trebuchet MS" w:hAnsi="Trebuchet MS" w:cs="Arial"/>
-                <w:sz w:val="24"/>
-                <w:szCs w:val="24"/>
-                <w:lang w:val="en-US" w:eastAsia="tr-TR" w:bidi="tr-TR"/>
-              </w:rPr>
-              <w:t>alanlarında</w:t>
-            </w:r>
-            <w:proofErr w:type="spellEnd"/>
-            <w:r>
-              <w:rPr>
-                <w:rFonts w:ascii="Trebuchet MS" w:hAnsi="Trebuchet MS" w:cs="Arial"/>
-                <w:sz w:val="24"/>
-                <w:szCs w:val="24"/>
-                <w:lang w:val="en-US" w:eastAsia="tr-TR" w:bidi="tr-TR"/>
-              </w:rPr>
-              <w:t xml:space="preserve"> </w:t>
-            </w:r>
-            <w:proofErr w:type="spellStart"/>
-            <w:r>
-              <w:rPr>
-                <w:rFonts w:ascii="Trebuchet MS" w:hAnsi="Trebuchet MS" w:cs="Arial"/>
-                <w:sz w:val="24"/>
-                <w:szCs w:val="24"/>
-                <w:lang w:val="en-US" w:eastAsia="tr-TR" w:bidi="tr-TR"/>
-              </w:rPr>
-              <w:t>araştırma</w:t>
-            </w:r>
-            <w:proofErr w:type="spellEnd"/>
-            <w:r>
-              <w:rPr>
-                <w:rFonts w:ascii="Trebuchet MS" w:hAnsi="Trebuchet MS" w:cs="Arial"/>
-                <w:sz w:val="24"/>
-                <w:szCs w:val="24"/>
-                <w:lang w:val="en-US" w:eastAsia="tr-TR" w:bidi="tr-TR"/>
-              </w:rPr>
-              <w:t xml:space="preserve">, </w:t>
-            </w:r>
-            <w:proofErr w:type="spellStart"/>
-            <w:r>
-              <w:rPr>
-                <w:rFonts w:ascii="Trebuchet MS" w:hAnsi="Trebuchet MS" w:cs="Arial"/>
-                <w:sz w:val="24"/>
-                <w:szCs w:val="24"/>
-                <w:lang w:val="en-US" w:eastAsia="tr-TR" w:bidi="tr-TR"/>
-              </w:rPr>
-              <w:t>tasarım</w:t>
-            </w:r>
-            <w:proofErr w:type="spellEnd"/>
-            <w:r>
-              <w:rPr>
-                <w:rFonts w:ascii="Trebuchet MS" w:hAnsi="Trebuchet MS" w:cs="Arial"/>
-                <w:sz w:val="24"/>
-                <w:szCs w:val="24"/>
-                <w:lang w:val="en-US" w:eastAsia="tr-TR" w:bidi="tr-TR"/>
-              </w:rPr>
-              <w:t xml:space="preserve">, </w:t>
-            </w:r>
-            <w:proofErr w:type="spellStart"/>
-            <w:r>
-              <w:rPr>
-                <w:rFonts w:ascii="Trebuchet MS" w:hAnsi="Trebuchet MS" w:cs="Arial"/>
-                <w:sz w:val="24"/>
-                <w:szCs w:val="24"/>
-                <w:lang w:val="en-US" w:eastAsia="tr-TR" w:bidi="tr-TR"/>
-              </w:rPr>
-              <w:t>uygulama</w:t>
-            </w:r>
-            <w:proofErr w:type="spellEnd"/>
-            <w:r>
-              <w:rPr>
-                <w:rFonts w:ascii="Trebuchet MS" w:hAnsi="Trebuchet MS" w:cs="Arial"/>
-                <w:sz w:val="24"/>
-                <w:szCs w:val="24"/>
-                <w:lang w:val="en-US" w:eastAsia="tr-TR" w:bidi="tr-TR"/>
-              </w:rPr>
-              <w:t xml:space="preserve"> ve test </w:t>
-            </w:r>
-            <w:proofErr w:type="spellStart"/>
-            <w:r>
-              <w:rPr>
-                <w:rFonts w:ascii="Trebuchet MS" w:hAnsi="Trebuchet MS" w:cs="Arial"/>
-                <w:sz w:val="24"/>
-                <w:szCs w:val="24"/>
-                <w:lang w:val="en-US" w:eastAsia="tr-TR" w:bidi="tr-TR"/>
-              </w:rPr>
-              <w:t>aşamalarına</w:t>
-            </w:r>
-            <w:proofErr w:type="spellEnd"/>
-            <w:r>
-              <w:rPr>
-                <w:rFonts w:ascii="Trebuchet MS" w:hAnsi="Trebuchet MS" w:cs="Arial"/>
-                <w:sz w:val="24"/>
-                <w:szCs w:val="24"/>
-                <w:lang w:val="en-US" w:eastAsia="tr-TR" w:bidi="tr-TR"/>
-              </w:rPr>
-              <w:t xml:space="preserve"> </w:t>
-            </w:r>
-            <w:proofErr w:type="spellStart"/>
-            <w:r>
-              <w:rPr>
-                <w:rFonts w:ascii="Trebuchet MS" w:hAnsi="Trebuchet MS" w:cs="Arial"/>
-                <w:sz w:val="24"/>
-                <w:szCs w:val="24"/>
-                <w:lang w:val="en-US" w:eastAsia="tr-TR" w:bidi="tr-TR"/>
-              </w:rPr>
-              <w:t>katkı</w:t>
-            </w:r>
-            <w:proofErr w:type="spellEnd"/>
-            <w:r>
-              <w:rPr>
-                <w:rFonts w:ascii="Trebuchet MS" w:hAnsi="Trebuchet MS" w:cs="Arial"/>
-                <w:sz w:val="24"/>
-                <w:szCs w:val="24"/>
-                <w:lang w:val="en-US" w:eastAsia="tr-TR" w:bidi="tr-TR"/>
-              </w:rPr>
-              <w:t xml:space="preserve"> </w:t>
-            </w:r>
-            <w:proofErr w:type="spellStart"/>
-            <w:r>
-              <w:rPr>
-                <w:rFonts w:ascii="Trebuchet MS" w:hAnsi="Trebuchet MS" w:cs="Arial"/>
-                <w:sz w:val="24"/>
-                <w:szCs w:val="24"/>
-                <w:lang w:val="en-US" w:eastAsia="tr-TR" w:bidi="tr-TR"/>
-              </w:rPr>
-              <w:t>sağlayarak</w:t>
-            </w:r>
-            <w:proofErr w:type="spellEnd"/>
-            <w:r>
-              <w:rPr>
-                <w:rFonts w:ascii="Trebuchet MS" w:hAnsi="Trebuchet MS" w:cs="Arial"/>
-                <w:sz w:val="24"/>
-                <w:szCs w:val="24"/>
-                <w:lang w:val="en-US" w:eastAsia="tr-TR" w:bidi="tr-TR"/>
-              </w:rPr>
-              <w:t xml:space="preserve"> hem </w:t>
-            </w:r>
-            <w:proofErr w:type="spellStart"/>
-            <w:r>
-              <w:rPr>
-                <w:rFonts w:ascii="Trebuchet MS" w:hAnsi="Trebuchet MS" w:cs="Arial"/>
-                <w:sz w:val="24"/>
-                <w:szCs w:val="24"/>
-                <w:lang w:val="en-US" w:eastAsia="tr-TR" w:bidi="tr-TR"/>
-              </w:rPr>
-              <w:t>yarışma</w:t>
-            </w:r>
-            <w:proofErr w:type="spellEnd"/>
-            <w:r>
-              <w:rPr>
-                <w:rFonts w:ascii="Trebuchet MS" w:hAnsi="Trebuchet MS" w:cs="Arial"/>
-                <w:sz w:val="24"/>
-                <w:szCs w:val="24"/>
-                <w:lang w:val="en-US" w:eastAsia="tr-TR" w:bidi="tr-TR"/>
-              </w:rPr>
-              <w:t xml:space="preserve"> </w:t>
-            </w:r>
-            <w:proofErr w:type="spellStart"/>
-            <w:r>
-              <w:rPr>
-                <w:rFonts w:ascii="Trebuchet MS" w:hAnsi="Trebuchet MS" w:cs="Arial"/>
-                <w:sz w:val="24"/>
-                <w:szCs w:val="24"/>
-                <w:lang w:val="en-US" w:eastAsia="tr-TR" w:bidi="tr-TR"/>
-              </w:rPr>
-              <w:t>şartnamesine</w:t>
-            </w:r>
-            <w:proofErr w:type="spellEnd"/>
-            <w:r>
-              <w:rPr>
-                <w:rFonts w:ascii="Trebuchet MS" w:hAnsi="Trebuchet MS" w:cs="Arial"/>
-                <w:sz w:val="24"/>
-                <w:szCs w:val="24"/>
-                <w:lang w:val="en-US" w:eastAsia="tr-TR" w:bidi="tr-TR"/>
-              </w:rPr>
-              <w:t xml:space="preserve"> </w:t>
-            </w:r>
-            <w:proofErr w:type="spellStart"/>
-            <w:r>
-              <w:rPr>
-                <w:rFonts w:ascii="Trebuchet MS" w:hAnsi="Trebuchet MS" w:cs="Arial"/>
-                <w:sz w:val="24"/>
-                <w:szCs w:val="24"/>
-                <w:lang w:val="en-US" w:eastAsia="tr-TR" w:bidi="tr-TR"/>
-              </w:rPr>
-              <w:t>uygun</w:t>
-            </w:r>
-            <w:proofErr w:type="spellEnd"/>
-            <w:r>
-              <w:rPr>
-                <w:rFonts w:ascii="Trebuchet MS" w:hAnsi="Trebuchet MS" w:cs="Arial"/>
-                <w:sz w:val="24"/>
-                <w:szCs w:val="24"/>
-                <w:lang w:val="en-US" w:eastAsia="tr-TR" w:bidi="tr-TR"/>
-              </w:rPr>
-              <w:t xml:space="preserve"> </w:t>
-            </w:r>
-            <w:proofErr w:type="spellStart"/>
-            <w:r>
-              <w:rPr>
-                <w:rFonts w:ascii="Trebuchet MS" w:hAnsi="Trebuchet MS" w:cs="Arial"/>
-                <w:sz w:val="24"/>
-                <w:szCs w:val="24"/>
-                <w:lang w:val="en-US" w:eastAsia="tr-TR" w:bidi="tr-TR"/>
-              </w:rPr>
-              <w:t>bir</w:t>
-            </w:r>
-            <w:proofErr w:type="spellEnd"/>
-            <w:r>
-              <w:rPr>
-                <w:rFonts w:ascii="Trebuchet MS" w:hAnsi="Trebuchet MS" w:cs="Arial"/>
-                <w:sz w:val="24"/>
-                <w:szCs w:val="24"/>
-                <w:lang w:val="en-US" w:eastAsia="tr-TR" w:bidi="tr-TR"/>
-              </w:rPr>
-              <w:t xml:space="preserve"> </w:t>
-            </w:r>
-            <w:proofErr w:type="spellStart"/>
-            <w:r>
-              <w:rPr>
-                <w:rFonts w:ascii="Trebuchet MS" w:hAnsi="Trebuchet MS" w:cs="Arial"/>
-                <w:sz w:val="24"/>
-                <w:szCs w:val="24"/>
-                <w:lang w:val="en-US" w:eastAsia="tr-TR" w:bidi="tr-TR"/>
-              </w:rPr>
-              <w:t>ürün</w:t>
-            </w:r>
-            <w:proofErr w:type="spellEnd"/>
-            <w:r>
-              <w:rPr>
-                <w:rFonts w:ascii="Trebuchet MS" w:hAnsi="Trebuchet MS" w:cs="Arial"/>
-                <w:sz w:val="24"/>
-                <w:szCs w:val="24"/>
-                <w:lang w:val="en-US" w:eastAsia="tr-TR" w:bidi="tr-TR"/>
-              </w:rPr>
-              <w:t xml:space="preserve"> </w:t>
-            </w:r>
-            <w:proofErr w:type="spellStart"/>
-            <w:r>
-              <w:rPr>
-                <w:rFonts w:ascii="Trebuchet MS" w:hAnsi="Trebuchet MS" w:cs="Arial"/>
-                <w:sz w:val="24"/>
-                <w:szCs w:val="24"/>
-                <w:lang w:val="en-US" w:eastAsia="tr-TR" w:bidi="tr-TR"/>
-              </w:rPr>
-              <w:t>geliştirmeyi</w:t>
-            </w:r>
-            <w:proofErr w:type="spellEnd"/>
-            <w:r>
-              <w:rPr>
-                <w:rFonts w:ascii="Trebuchet MS" w:hAnsi="Trebuchet MS" w:cs="Arial"/>
-                <w:sz w:val="24"/>
-                <w:szCs w:val="24"/>
-                <w:lang w:val="en-US" w:eastAsia="tr-TR" w:bidi="tr-TR"/>
-              </w:rPr>
-              <w:t xml:space="preserve"> hem de </w:t>
-            </w:r>
-            <w:proofErr w:type="spellStart"/>
-            <w:r>
-              <w:rPr>
-                <w:rFonts w:ascii="Trebuchet MS" w:hAnsi="Trebuchet MS" w:cs="Arial"/>
-                <w:sz w:val="24"/>
-                <w:szCs w:val="24"/>
-                <w:lang w:val="en-US" w:eastAsia="tr-TR" w:bidi="tr-TR"/>
-              </w:rPr>
-              <w:t>teknik</w:t>
-            </w:r>
-            <w:proofErr w:type="spellEnd"/>
-            <w:r>
-              <w:rPr>
-                <w:rFonts w:ascii="Trebuchet MS" w:hAnsi="Trebuchet MS" w:cs="Arial"/>
-                <w:sz w:val="24"/>
-                <w:szCs w:val="24"/>
-                <w:lang w:val="en-US" w:eastAsia="tr-TR" w:bidi="tr-TR"/>
-              </w:rPr>
-              <w:t xml:space="preserve"> </w:t>
-            </w:r>
-            <w:proofErr w:type="spellStart"/>
-            <w:r>
-              <w:rPr>
-                <w:rFonts w:ascii="Trebuchet MS" w:hAnsi="Trebuchet MS" w:cs="Arial"/>
-                <w:sz w:val="24"/>
-                <w:szCs w:val="24"/>
-                <w:lang w:val="en-US" w:eastAsia="tr-TR" w:bidi="tr-TR"/>
-              </w:rPr>
-              <w:t>deneyim</w:t>
-            </w:r>
-            <w:proofErr w:type="spellEnd"/>
-            <w:r>
-              <w:rPr>
-                <w:rFonts w:ascii="Trebuchet MS" w:hAnsi="Trebuchet MS" w:cs="Arial"/>
-                <w:sz w:val="24"/>
-                <w:szCs w:val="24"/>
-                <w:lang w:val="en-US" w:eastAsia="tr-TR" w:bidi="tr-TR"/>
-              </w:rPr>
-              <w:t xml:space="preserve"> </w:t>
-            </w:r>
-            <w:proofErr w:type="spellStart"/>
-            <w:r>
-              <w:rPr>
-                <w:rFonts w:ascii="Trebuchet MS" w:hAnsi="Trebuchet MS" w:cs="Arial"/>
-                <w:sz w:val="24"/>
-                <w:szCs w:val="24"/>
-                <w:lang w:val="en-US" w:eastAsia="tr-TR" w:bidi="tr-TR"/>
-              </w:rPr>
-              <w:t>kazanmayı</w:t>
-            </w:r>
-            <w:proofErr w:type="spellEnd"/>
-            <w:r>
-              <w:rPr>
-                <w:rFonts w:ascii="Trebuchet MS" w:hAnsi="Trebuchet MS" w:cs="Arial"/>
-                <w:sz w:val="24"/>
-                <w:szCs w:val="24"/>
-                <w:lang w:val="en-US" w:eastAsia="tr-TR" w:bidi="tr-TR"/>
-              </w:rPr>
-              <w:t xml:space="preserve"> </w:t>
-            </w:r>
-            <w:proofErr w:type="spellStart"/>
-            <w:r>
-              <w:rPr>
-                <w:rFonts w:ascii="Trebuchet MS" w:hAnsi="Trebuchet MS" w:cs="Arial"/>
-                <w:sz w:val="24"/>
-                <w:szCs w:val="24"/>
-                <w:lang w:val="en-US" w:eastAsia="tr-TR" w:bidi="tr-TR"/>
-              </w:rPr>
-              <w:t>amaçlamaktadır</w:t>
-            </w:r>
-            <w:proofErr w:type="spellEnd"/>
-            <w:r>
-              <w:rPr>
-                <w:rFonts w:ascii="Trebuchet MS" w:hAnsi="Trebuchet MS" w:cs="Arial"/>
-                <w:sz w:val="24"/>
-                <w:szCs w:val="24"/>
-                <w:lang w:val="en-US" w:eastAsia="tr-TR" w:bidi="tr-TR"/>
+                <w:b/>
+                <w:i/>
+                <w:sz w:val="24"/>
+                <w:szCs w:val="24"/>
+                <w:u w:val="single"/>
+                <w:lang w:eastAsia="tr-TR" w:bidi="tr-TR"/>
               </w:rPr>
               <w:t>.</w:t>
             </w:r>
-          </w:p>
-          <w:p>
-            <w:pPr>
-              <w:spacing w:line="276" w:lineRule="auto"/>
-              <w:jc w:val="both"/>
-              <w:rPr>
-                <w:rFonts w:ascii="Trebuchet MS" w:hAnsi="Trebuchet MS" w:cs="Arial"/>
-                <w:sz w:val="24"/>
-                <w:szCs w:val="24"/>
-                <w:lang w:val="en-US" w:eastAsia="tr-TR" w:bidi="tr-TR"/>
+            <w:r>
+              <w:rPr>
+                <w:rFonts w:ascii="Trebuchet MS" w:hAnsi="Trebuchet MS" w:cs="Arial"/>
+                <w:b/>
+                <w:i/>
+                <w:sz w:val="24"/>
+                <w:szCs w:val="24"/>
+                <w:u w:val="single"/>
+                <w:lang w:eastAsia="tr-TR" w:bidi="tr-TR"/>
+              </w:rPr>
+              <w:t>C. kimlik numarası vb.) İÇERMEMESİ</w:t>
+            </w:r>
+            <w:r>
+              <w:rPr>
+                <w:rFonts w:ascii="Trebuchet MS" w:hAnsi="Trebuchet MS" w:cs="Arial"/>
+                <w:i/>
+                <w:sz w:val="24"/>
+                <w:szCs w:val="24"/>
+                <w:lang w:eastAsia="tr-TR" w:bidi="tr-TR"/>
+              </w:rPr>
+              <w:t xml:space="preserve"> gereklidir.</w:t>
+            </w:r>
+          </w:p>
+          <w:p>
+            <w:pPr>
+              <w:pStyle w:val="ListeParagraf"/>
+              <w:spacing w:line="276" w:lineRule="auto"/>
+              <w:rPr>
+                <w:rFonts w:ascii="Trebuchet MS" w:hAnsi="Trebuchet MS" w:cs="Arial"/>
+                <w:sz w:val="24"/>
+                <w:szCs w:val="24"/>
+                <w:lang w:eastAsia="tr-TR" w:bidi="tr-TR"/>
               </w:rPr>
             </w:pPr>
           </w:p>
@@ -4209,7 +3462,7 @@
     </w:p>
     <w:tbl>
       <w:tblPr>
-        <w:tblStyle w:val="TableGrid"/>
+        <w:tblStyle w:val="TabloKlavuzu"/>
         <w:tblW w:w="0" w:type="auto"/>
         <w:tblInd w:w="-40" w:type="dxa"/>
         <w:tblLook w:val="04A0" w:firstRow="1" w:lastRow="0" w:firstColumn="1" w:lastColumn="0" w:noHBand="0" w:noVBand="1"/>
@@ -4273,19 +3526,19 @@
           </w:tcPr>
           <w:p>
             <w:pPr>
-              <w:pStyle w:val="ListParagraph"/>
-              <w:spacing w:line="276" w:lineRule="auto"/>
-              <w:rPr>
-                <w:rFonts w:ascii="Trebuchet MS" w:hAnsi="Trebuchet MS" w:cs="Arial"/>
-                <w:sz w:val="24"/>
-                <w:szCs w:val="24"/>
-                <w:lang w:eastAsia="tr-TR" w:bidi="tr-TR"/>
-              </w:rPr>
-            </w:pPr>
-          </w:p>
-          <w:p>
-            <w:pPr>
-              <w:pStyle w:val="ListParagraph"/>
+              <w:pStyle w:val="ListeParagraf"/>
+              <w:spacing w:line="276" w:lineRule="auto"/>
+              <w:rPr>
+                <w:rFonts w:ascii="Trebuchet MS" w:hAnsi="Trebuchet MS" w:cs="Arial"/>
+                <w:sz w:val="24"/>
+                <w:szCs w:val="24"/>
+                <w:lang w:eastAsia="tr-TR" w:bidi="tr-TR"/>
+              </w:rPr>
+            </w:pPr>
+          </w:p>
+          <w:p>
+            <w:pPr>
+              <w:pStyle w:val="ListeParagraf"/>
               <w:numPr>
                 <w:ilvl w:val="0"/>
                 <w:numId w:val="48"/>
@@ -4363,7 +3616,7 @@
           </w:p>
           <w:p>
             <w:pPr>
-              <w:pStyle w:val="ListParagraph"/>
+              <w:pStyle w:val="ListeParagraf"/>
               <w:numPr>
                 <w:ilvl w:val="0"/>
                 <w:numId w:val="48"/>
@@ -4467,7 +3720,7 @@
           </w:p>
           <w:p>
             <w:pPr>
-              <w:pStyle w:val="ListParagraph"/>
+              <w:pStyle w:val="ListeParagraf"/>
               <w:numPr>
                 <w:ilvl w:val="0"/>
                 <w:numId w:val="48"/>
@@ -4495,7 +3748,7 @@
           </w:p>
           <w:p>
             <w:pPr>
-              <w:pStyle w:val="ListParagraph"/>
+              <w:pStyle w:val="ListeParagraf"/>
               <w:numPr>
                 <w:ilvl w:val="0"/>
                 <w:numId w:val="48"/>
@@ -4558,7 +3811,7 @@
           </w:p>
           <w:p>
             <w:pPr>
-              <w:pStyle w:val="ListParagraph"/>
+              <w:pStyle w:val="ListeParagraf"/>
               <w:spacing w:line="276" w:lineRule="auto"/>
               <w:rPr>
                 <w:rFonts w:ascii="Trebuchet MS" w:hAnsi="Trebuchet MS" w:cs="Arial"/>
@@ -4651,7 +3904,7 @@
     </w:p>
     <w:tbl>
       <w:tblPr>
-        <w:tblStyle w:val="TableGrid"/>
+        <w:tblStyle w:val="TabloKlavuzu"/>
         <w:tblW w:w="0" w:type="auto"/>
         <w:tblInd w:w="-40" w:type="dxa"/>
         <w:tblLook w:val="04A0" w:firstRow="1" w:lastRow="0" w:firstColumn="1" w:lastColumn="0" w:noHBand="0" w:noVBand="1"/>
@@ -4701,7 +3954,6 @@
                 <w:szCs w:val="24"/>
                 <w:lang w:eastAsia="tr-TR" w:bidi="tr-TR"/>
               </w:rPr>
-              <w:lastRenderedPageBreak/>
               <w:t>BİLEŞENLER</w:t>
             </w:r>
           </w:p>
@@ -6809,6 +6061,7 @@
                 <w:szCs w:val="24"/>
                 <w:lang w:eastAsia="tr-TR" w:bidi="tr-TR"/>
               </w:rPr>
+              <w:lastRenderedPageBreak/>
               <w:t>BİLEŞENLER</w:t>
             </w:r>
           </w:p>
@@ -6999,7 +6252,6 @@
                 <w:szCs w:val="24"/>
                 <w:lang w:eastAsia="tr-TR" w:bidi="tr-TR"/>
               </w:rPr>
-              <w:lastRenderedPageBreak/>
               <w:t>ELEKTRONİK</w:t>
             </w:r>
           </w:p>
@@ -8705,6 +7957,7 @@
                 <w:szCs w:val="24"/>
                 <w:lang w:eastAsia="tr-TR" w:bidi="tr-TR"/>
               </w:rPr>
+              <w:lastRenderedPageBreak/>
               <w:t>ALGORİTMALAR</w:t>
             </w:r>
           </w:p>
@@ -8856,7 +8109,6 @@
                 <w:szCs w:val="24"/>
                 <w:lang w:eastAsia="tr-TR" w:bidi="tr-TR"/>
               </w:rPr>
-              <w:lastRenderedPageBreak/>
               <w:t>Yük Alma Taşıma Bırakma</w:t>
             </w:r>
           </w:p>
@@ -10354,7 +9606,7 @@
 <w:ftr xmlns:wpc="http://schemas.microsoft.com/office/word/2010/wordprocessingCanvas" xmlns:cx="http://schemas.microsoft.com/office/drawing/2014/chartex" xmlns:cx1="http://schemas.microsoft.com/office/drawing/2015/9/8/chartex" xmlns:cx2="http://schemas.microsoft.com/office/drawing/2015/10/21/chartex" xmlns:cx3="http://schemas.microsoft.com/office/drawing/2016/5/9/chartex" xmlns:cx4="http://schemas.microsoft.com/office/drawing/2016/5/10/chartex" xmlns:cx5="http://schemas.microsoft.com/office/drawing/2016/5/11/chartex" xmlns:cx6="http://schemas.microsoft.com/office/drawing/2016/5/12/chartex" xmlns:cx7="http://schemas.microsoft.com/office/drawing/2016/5/13/chartex" xmlns:cx8="http://schemas.microsoft.com/office/drawing/2016/5/14/chartex" xmlns:mc="http://schemas.openxmlformats.org/markup-compatibility/2006" xmlns:aink="http://schemas.microsoft.com/office/drawing/2016/ink" xmlns:am3d="http://schemas.microsoft.com/office/drawing/2017/model3d" xmlns:o="urn:schemas-microsoft-com:office:office" xmlns:oel="http://schemas.microsoft.com/office/2019/extlst" xmlns:r="http://schemas.openxmlformats.org/officeDocument/2006/relationships" xmlns:m="http://schemas.openxmlformats.org/officeDocument/2006/math" xmlns:v="urn:schemas-microsoft-com:vml" xmlns:wp14="http://schemas.microsoft.com/office/word/2010/wordprocessingDrawing" xmlns:wp="http://schemas.openxmlformats.org/drawingml/2006/wordprocessingDrawing" xmlns:w10="urn:schemas-microsoft-com:office:word" xmlns:w="http://schemas.openxmlformats.org/wordprocessingml/2006/main" xmlns:w14="http://schemas.microsoft.com/office/word/2010/wordml" xmlns:w15="http://schemas.microsoft.com/office/word/2012/wordml" xmlns:w16cex="http://schemas.microsoft.com/office/word/2018/wordml/cex" xmlns:w16cid="http://schemas.microsoft.com/office/word/2016/wordml/cid" xmlns:w16="http://schemas.microsoft.com/office/word/2018/wordml" xmlns:w16du="http://schemas.microsoft.com/office/word/2023/wordml/word16du" xmlns:w16sdtdh="http://schemas.microsoft.com/office/word/2020/wordml/sdtdatahash" xmlns:w16sdtfl="http://schemas.microsoft.com/office/word/2024/wordml/sdtformatlock" xmlns:w16se="http://schemas.microsoft.com/office/word/2015/wordml/symex" xmlns:wpg="http://schemas.microsoft.com/office/word/2010/wordprocessingGroup" xmlns:wpi="http://schemas.microsoft.com/office/word/2010/wordprocessingInk" xmlns:wne="http://schemas.microsoft.com/office/word/2006/wordml" xmlns:wps="http://schemas.microsoft.com/office/word/2010/wordprocessingShape" mc:Ignorable="w14 w15 w16se w16cid w16 w16cex w16sdtdh w16sdtfl w16du wp14">
   <w:p>
     <w:pPr>
-      <w:pStyle w:val="Footer"/>
+      <w:pStyle w:val="AltBilgi"/>
     </w:pPr>
     <w:r>
       <w:rPr>
@@ -10484,7 +9736,7 @@
 <w:ftr xmlns:wpc="http://schemas.microsoft.com/office/word/2010/wordprocessingCanvas" xmlns:cx="http://schemas.microsoft.com/office/drawing/2014/chartex" xmlns:cx1="http://schemas.microsoft.com/office/drawing/2015/9/8/chartex" xmlns:cx2="http://schemas.microsoft.com/office/drawing/2015/10/21/chartex" xmlns:cx3="http://schemas.microsoft.com/office/drawing/2016/5/9/chartex" xmlns:cx4="http://schemas.microsoft.com/office/drawing/2016/5/10/chartex" xmlns:cx5="http://schemas.microsoft.com/office/drawing/2016/5/11/chartex" xmlns:cx6="http://schemas.microsoft.com/office/drawing/2016/5/12/chartex" xmlns:cx7="http://schemas.microsoft.com/office/drawing/2016/5/13/chartex" xmlns:cx8="http://schemas.microsoft.com/office/drawing/2016/5/14/chartex" xmlns:mc="http://schemas.openxmlformats.org/markup-compatibility/2006" xmlns:aink="http://schemas.microsoft.com/office/drawing/2016/ink" xmlns:am3d="http://schemas.microsoft.com/office/drawing/2017/model3d" xmlns:o="urn:schemas-microsoft-com:office:office" xmlns:oel="http://schemas.microsoft.com/office/2019/extlst" xmlns:r="http://schemas.openxmlformats.org/officeDocument/2006/relationships" xmlns:m="http://schemas.openxmlformats.org/officeDocument/2006/math" xmlns:v="urn:schemas-microsoft-com:vml" xmlns:wp14="http://schemas.microsoft.com/office/word/2010/wordprocessingDrawing" xmlns:wp="http://schemas.openxmlformats.org/drawingml/2006/wordprocessingDrawing" xmlns:w10="urn:schemas-microsoft-com:office:word" xmlns:w="http://schemas.openxmlformats.org/wordprocessingml/2006/main" xmlns:w14="http://schemas.microsoft.com/office/word/2010/wordml" xmlns:w15="http://schemas.microsoft.com/office/word/2012/wordml" xmlns:w16cex="http://schemas.microsoft.com/office/word/2018/wordml/cex" xmlns:w16cid="http://schemas.microsoft.com/office/word/2016/wordml/cid" xmlns:w16="http://schemas.microsoft.com/office/word/2018/wordml" xmlns:w16du="http://schemas.microsoft.com/office/word/2023/wordml/word16du" xmlns:w16sdtdh="http://schemas.microsoft.com/office/word/2020/wordml/sdtdatahash" xmlns:w16sdtfl="http://schemas.microsoft.com/office/word/2024/wordml/sdtformatlock" xmlns:w16se="http://schemas.microsoft.com/office/word/2015/wordml/symex" xmlns:wpg="http://schemas.microsoft.com/office/word/2010/wordprocessingGroup" xmlns:wpi="http://schemas.microsoft.com/office/word/2010/wordprocessingInk" xmlns:wne="http://schemas.microsoft.com/office/word/2006/wordml" xmlns:wps="http://schemas.microsoft.com/office/word/2010/wordprocessingShape" mc:Ignorable="w14 w15 w16se w16cid w16 w16cex w16sdtdh w16sdtfl w16du wp14">
   <w:p>
     <w:pPr>
-      <w:pStyle w:val="Footer"/>
+      <w:pStyle w:val="AltBilgi"/>
     </w:pPr>
     <w:r>
       <w:rPr>
@@ -10639,7 +9891,7 @@
 <w:hdr xmlns:wpc="http://schemas.microsoft.com/office/word/2010/wordprocessingCanvas" xmlns:cx="http://schemas.microsoft.com/office/drawing/2014/chartex" xmlns:cx1="http://schemas.microsoft.com/office/drawing/2015/9/8/chartex" xmlns:cx2="http://schemas.microsoft.com/office/drawing/2015/10/21/chartex" xmlns:cx3="http://schemas.microsoft.com/office/drawing/2016/5/9/chartex" xmlns:cx4="http://schemas.microsoft.com/office/drawing/2016/5/10/chartex" xmlns:cx5="http://schemas.microsoft.com/office/drawing/2016/5/11/chartex" xmlns:cx6="http://schemas.microsoft.com/office/drawing/2016/5/12/chartex" xmlns:cx7="http://schemas.microsoft.com/office/drawing/2016/5/13/chartex" xmlns:cx8="http://schemas.microsoft.com/office/drawing/2016/5/14/chartex" xmlns:mc="http://schemas.openxmlformats.org/markup-compatibility/2006" xmlns:aink="http://schemas.microsoft.com/office/drawing/2016/ink" xmlns:am3d="http://schemas.microsoft.com/office/drawing/2017/model3d" xmlns:o="urn:schemas-microsoft-com:office:office" xmlns:oel="http://schemas.microsoft.com/office/2019/extlst" xmlns:r="http://schemas.openxmlformats.org/officeDocument/2006/relationships" xmlns:m="http://schemas.openxmlformats.org/officeDocument/2006/math" xmlns:v="urn:schemas-microsoft-com:vml" xmlns:wp14="http://schemas.microsoft.com/office/word/2010/wordprocessingDrawing" xmlns:wp="http://schemas.openxmlformats.org/drawingml/2006/wordprocessingDrawing" xmlns:w10="urn:schemas-microsoft-com:office:word" xmlns:w="http://schemas.openxmlformats.org/wordprocessingml/2006/main" xmlns:w14="http://schemas.microsoft.com/office/word/2010/wordml" xmlns:w15="http://schemas.microsoft.com/office/word/2012/wordml" xmlns:w16cex="http://schemas.microsoft.com/office/word/2018/wordml/cex" xmlns:w16cid="http://schemas.microsoft.com/office/word/2016/wordml/cid" xmlns:w16="http://schemas.microsoft.com/office/word/2018/wordml" xmlns:w16du="http://schemas.microsoft.com/office/word/2023/wordml/word16du" xmlns:w16sdtdh="http://schemas.microsoft.com/office/word/2020/wordml/sdtdatahash" xmlns:w16sdtfl="http://schemas.microsoft.com/office/word/2024/wordml/sdtformatlock" xmlns:w16se="http://schemas.microsoft.com/office/word/2015/wordml/symex" xmlns:wpg="http://schemas.microsoft.com/office/word/2010/wordprocessingGroup" xmlns:wpi="http://schemas.microsoft.com/office/word/2010/wordprocessingInk" xmlns:wne="http://schemas.microsoft.com/office/word/2006/wordml" xmlns:wps="http://schemas.microsoft.com/office/word/2010/wordprocessingShape" mc:Ignorable="w14 w15 w16se w16cid w16 w16cex w16sdtdh w16sdtfl w16du wp14">
   <w:p>
     <w:pPr>
-      <w:pStyle w:val="Header"/>
+      <w:pStyle w:val="stBilgi"/>
     </w:pPr>
     <w:r>
       <w:rPr>
@@ -10679,7 +9931,7 @@
 <w:hdr xmlns:wpc="http://schemas.microsoft.com/office/word/2010/wordprocessingCanvas" xmlns:cx="http://schemas.microsoft.com/office/drawing/2014/chartex" xmlns:cx1="http://schemas.microsoft.com/office/drawing/2015/9/8/chartex" xmlns:cx2="http://schemas.microsoft.com/office/drawing/2015/10/21/chartex" xmlns:cx3="http://schemas.microsoft.com/office/drawing/2016/5/9/chartex" xmlns:cx4="http://schemas.microsoft.com/office/drawing/2016/5/10/chartex" xmlns:cx5="http://schemas.microsoft.com/office/drawing/2016/5/11/chartex" xmlns:cx6="http://schemas.microsoft.com/office/drawing/2016/5/12/chartex" xmlns:cx7="http://schemas.microsoft.com/office/drawing/2016/5/13/chartex" xmlns:cx8="http://schemas.microsoft.com/office/drawing/2016/5/14/chartex" xmlns:mc="http://schemas.openxmlformats.org/markup-compatibility/2006" xmlns:aink="http://schemas.microsoft.com/office/drawing/2016/ink" xmlns:am3d="http://schemas.microsoft.com/office/drawing/2017/model3d" xmlns:o="urn:schemas-microsoft-com:office:office" xmlns:oel="http://schemas.microsoft.com/office/2019/extlst" xmlns:r="http://schemas.openxmlformats.org/officeDocument/2006/relationships" xmlns:m="http://schemas.openxmlformats.org/officeDocument/2006/math" xmlns:v="urn:schemas-microsoft-com:vml" xmlns:wp14="http://schemas.microsoft.com/office/word/2010/wordprocessingDrawing" xmlns:wp="http://schemas.openxmlformats.org/drawingml/2006/wordprocessingDrawing" xmlns:w10="urn:schemas-microsoft-com:office:word" xmlns:w="http://schemas.openxmlformats.org/wordprocessingml/2006/main" xmlns:w14="http://schemas.microsoft.com/office/word/2010/wordml" xmlns:w15="http://schemas.microsoft.com/office/word/2012/wordml" xmlns:w16cex="http://schemas.microsoft.com/office/word/2018/wordml/cex" xmlns:w16cid="http://schemas.microsoft.com/office/word/2016/wordml/cid" xmlns:w16="http://schemas.microsoft.com/office/word/2018/wordml" xmlns:w16du="http://schemas.microsoft.com/office/word/2023/wordml/word16du" xmlns:w16sdtdh="http://schemas.microsoft.com/office/word/2020/wordml/sdtdatahash" xmlns:w16sdtfl="http://schemas.microsoft.com/office/word/2024/wordml/sdtformatlock" xmlns:w16se="http://schemas.microsoft.com/office/word/2015/wordml/symex" xmlns:wpg="http://schemas.microsoft.com/office/word/2010/wordprocessingGroup" xmlns:wpi="http://schemas.microsoft.com/office/word/2010/wordprocessingInk" xmlns:wne="http://schemas.microsoft.com/office/word/2006/wordml" xmlns:wps="http://schemas.microsoft.com/office/word/2010/wordprocessingShape" mc:Ignorable="w14 w15 w16se w16cid w16 w16cex w16sdtdh w16sdtfl w16du wp14">
   <w:p>
     <w:pPr>
-      <w:pStyle w:val="Header"/>
+      <w:pStyle w:val="stBilgi"/>
     </w:pPr>
     <w:r>
       <w:rPr>
@@ -10719,7 +9971,7 @@
 <w:hdr xmlns:wpc="http://schemas.microsoft.com/office/word/2010/wordprocessingCanvas" xmlns:cx="http://schemas.microsoft.com/office/drawing/2014/chartex" xmlns:cx1="http://schemas.microsoft.com/office/drawing/2015/9/8/chartex" xmlns:cx2="http://schemas.microsoft.com/office/drawing/2015/10/21/chartex" xmlns:cx3="http://schemas.microsoft.com/office/drawing/2016/5/9/chartex" xmlns:cx4="http://schemas.microsoft.com/office/drawing/2016/5/10/chartex" xmlns:cx5="http://schemas.microsoft.com/office/drawing/2016/5/11/chartex" xmlns:cx6="http://schemas.microsoft.com/office/drawing/2016/5/12/chartex" xmlns:cx7="http://schemas.microsoft.com/office/drawing/2016/5/13/chartex" xmlns:cx8="http://schemas.microsoft.com/office/drawing/2016/5/14/chartex" xmlns:mc="http://schemas.openxmlformats.org/markup-compatibility/2006" xmlns:aink="http://schemas.microsoft.com/office/drawing/2016/ink" xmlns:am3d="http://schemas.microsoft.com/office/drawing/2017/model3d" xmlns:o="urn:schemas-microsoft-com:office:office" xmlns:oel="http://schemas.microsoft.com/office/2019/extlst" xmlns:r="http://schemas.openxmlformats.org/officeDocument/2006/relationships" xmlns:m="http://schemas.openxmlformats.org/officeDocument/2006/math" xmlns:v="urn:schemas-microsoft-com:vml" xmlns:wp14="http://schemas.microsoft.com/office/word/2010/wordprocessingDrawing" xmlns:wp="http://schemas.openxmlformats.org/drawingml/2006/wordprocessingDrawing" xmlns:w10="urn:schemas-microsoft-com:office:word" xmlns:w="http://schemas.openxmlformats.org/wordprocessingml/2006/main" xmlns:w14="http://schemas.microsoft.com/office/word/2010/wordml" xmlns:w15="http://schemas.microsoft.com/office/word/2012/wordml" xmlns:w16cex="http://schemas.microsoft.com/office/word/2018/wordml/cex" xmlns:w16cid="http://schemas.microsoft.com/office/word/2016/wordml/cid" xmlns:w16="http://schemas.microsoft.com/office/word/2018/wordml" xmlns:w16du="http://schemas.microsoft.com/office/word/2023/wordml/word16du" xmlns:w16sdtdh="http://schemas.microsoft.com/office/word/2020/wordml/sdtdatahash" xmlns:w16sdtfl="http://schemas.microsoft.com/office/word/2024/wordml/sdtformatlock" xmlns:w16se="http://schemas.microsoft.com/office/word/2015/wordml/symex" xmlns:wpg="http://schemas.microsoft.com/office/word/2010/wordprocessingGroup" xmlns:wpi="http://schemas.microsoft.com/office/word/2010/wordprocessingInk" xmlns:wne="http://schemas.microsoft.com/office/word/2006/wordml" xmlns:wps="http://schemas.microsoft.com/office/word/2010/wordprocessingShape" mc:Ignorable="w14 w15 w16se w16cid w16 w16cex w16sdtdh w16sdtfl w16du wp14">
   <w:p>
     <w:pPr>
-      <w:pStyle w:val="Header"/>
+      <w:pStyle w:val="stBilgi"/>
     </w:pPr>
     <w:r>
       <w:rPr>
@@ -15244,11 +14496,11 @@
     <w:qFormat/>
     <w:rsid w:val="004D2D28"/>
   </w:style>
-  <w:style w:type="paragraph" w:styleId="Heading1">
+  <w:style w:type="paragraph" w:styleId="Balk1">
     <w:name w:val="heading 1"/>
     <w:basedOn w:val="Normal"/>
     <w:next w:val="Normal"/>
-    <w:link w:val="Heading1Char"/>
+    <w:link w:val="Balk1Char"/>
     <w:uiPriority w:val="1"/>
     <w:qFormat/>
     <w:rsid w:val="00FE6BAD"/>
@@ -15265,11 +14517,11 @@
       <w:szCs w:val="40"/>
     </w:rPr>
   </w:style>
-  <w:style w:type="paragraph" w:styleId="Heading2">
+  <w:style w:type="paragraph" w:styleId="Balk2">
     <w:name w:val="heading 2"/>
     <w:basedOn w:val="Normal"/>
     <w:next w:val="Normal"/>
-    <w:link w:val="Heading2Char"/>
+    <w:link w:val="Balk2Char"/>
     <w:uiPriority w:val="9"/>
     <w:unhideWhenUsed/>
     <w:qFormat/>
@@ -15287,11 +14539,11 @@
       <w:szCs w:val="32"/>
     </w:rPr>
   </w:style>
-  <w:style w:type="paragraph" w:styleId="Heading3">
+  <w:style w:type="paragraph" w:styleId="Balk3">
     <w:name w:val="heading 3"/>
     <w:basedOn w:val="Normal"/>
     <w:next w:val="Normal"/>
-    <w:link w:val="Heading3Char"/>
+    <w:link w:val="Balk3Char"/>
     <w:uiPriority w:val="9"/>
     <w:unhideWhenUsed/>
     <w:qFormat/>
@@ -15309,11 +14561,11 @@
       <w:szCs w:val="28"/>
     </w:rPr>
   </w:style>
-  <w:style w:type="paragraph" w:styleId="Heading4">
+  <w:style w:type="paragraph" w:styleId="Balk4">
     <w:name w:val="heading 4"/>
     <w:basedOn w:val="Normal"/>
     <w:next w:val="Normal"/>
-    <w:link w:val="Heading4Char"/>
+    <w:link w:val="Balk4Char"/>
     <w:uiPriority w:val="9"/>
     <w:unhideWhenUsed/>
     <w:qFormat/>
@@ -15332,11 +14584,11 @@
       <w:sz w:val="28"/>
     </w:rPr>
   </w:style>
-  <w:style w:type="paragraph" w:styleId="Heading5">
+  <w:style w:type="paragraph" w:styleId="Balk5">
     <w:name w:val="heading 5"/>
     <w:basedOn w:val="Normal"/>
     <w:next w:val="Normal"/>
-    <w:link w:val="Heading5Char"/>
+    <w:link w:val="Balk5Char"/>
     <w:uiPriority w:val="9"/>
     <w:semiHidden/>
     <w:unhideWhenUsed/>
@@ -15353,11 +14605,11 @@
       <w:color w:val="0F4761" w:themeColor="accent1" w:themeShade="BF"/>
     </w:rPr>
   </w:style>
-  <w:style w:type="paragraph" w:styleId="Heading6">
+  <w:style w:type="paragraph" w:styleId="Balk6">
     <w:name w:val="heading 6"/>
     <w:basedOn w:val="Normal"/>
     <w:next w:val="Normal"/>
-    <w:link w:val="Heading6Char"/>
+    <w:link w:val="Balk6Char"/>
     <w:uiPriority w:val="9"/>
     <w:semiHidden/>
     <w:unhideWhenUsed/>
@@ -15376,11 +14628,11 @@
       <w:color w:val="595959" w:themeColor="text1" w:themeTint="A6"/>
     </w:rPr>
   </w:style>
-  <w:style w:type="paragraph" w:styleId="Heading7">
+  <w:style w:type="paragraph" w:styleId="Balk7">
     <w:name w:val="heading 7"/>
     <w:basedOn w:val="Normal"/>
     <w:next w:val="Normal"/>
-    <w:link w:val="Heading7Char"/>
+    <w:link w:val="Balk7Char"/>
     <w:uiPriority w:val="9"/>
     <w:semiHidden/>
     <w:unhideWhenUsed/>
@@ -15397,11 +14649,11 @@
       <w:color w:val="595959" w:themeColor="text1" w:themeTint="A6"/>
     </w:rPr>
   </w:style>
-  <w:style w:type="paragraph" w:styleId="Heading8">
+  <w:style w:type="paragraph" w:styleId="Balk8">
     <w:name w:val="heading 8"/>
     <w:basedOn w:val="Normal"/>
     <w:next w:val="Normal"/>
-    <w:link w:val="Heading8Char"/>
+    <w:link w:val="Balk8Char"/>
     <w:uiPriority w:val="9"/>
     <w:semiHidden/>
     <w:unhideWhenUsed/>
@@ -15420,11 +14672,11 @@
       <w:color w:val="272727" w:themeColor="text1" w:themeTint="D8"/>
     </w:rPr>
   </w:style>
-  <w:style w:type="paragraph" w:styleId="Heading9">
+  <w:style w:type="paragraph" w:styleId="Balk9">
     <w:name w:val="heading 9"/>
     <w:basedOn w:val="Normal"/>
     <w:next w:val="Normal"/>
-    <w:link w:val="Heading9Char"/>
+    <w:link w:val="Balk9Char"/>
     <w:uiPriority w:val="9"/>
     <w:semiHidden/>
     <w:unhideWhenUsed/>
@@ -15441,12 +14693,13 @@
       <w:color w:val="272727" w:themeColor="text1" w:themeTint="D8"/>
     </w:rPr>
   </w:style>
-  <w:style w:type="character" w:default="1" w:styleId="DefaultParagraphFont">
+  <w:style w:type="character" w:default="1" w:styleId="VarsaylanParagrafYazTipi">
     <w:name w:val="Default Paragraph Font"/>
     <w:uiPriority w:val="1"/>
+    <w:semiHidden/>
     <w:unhideWhenUsed/>
   </w:style>
-  <w:style w:type="table" w:default="1" w:styleId="TableNormal">
+  <w:style w:type="table" w:default="1" w:styleId="NormalTablo">
     <w:name w:val="Normal Table"/>
     <w:uiPriority w:val="99"/>
     <w:semiHidden/>
@@ -15461,16 +14714,16 @@
       </w:tblCellMar>
     </w:tblPr>
   </w:style>
-  <w:style w:type="numbering" w:default="1" w:styleId="NoList">
+  <w:style w:type="numbering" w:default="1" w:styleId="ListeYok">
     <w:name w:val="No List"/>
     <w:uiPriority w:val="99"/>
     <w:semiHidden/>
     <w:unhideWhenUsed/>
   </w:style>
-  <w:style w:type="character" w:customStyle="1" w:styleId="Heading1Char">
-    <w:name w:val="Heading 1 Char"/>
-    <w:basedOn w:val="DefaultParagraphFont"/>
-    <w:link w:val="Heading1"/>
+  <w:style w:type="character" w:customStyle="1" w:styleId="Balk1Char">
+    <w:name w:val="Başlık 1 Char"/>
+    <w:basedOn w:val="VarsaylanParagrafYazTipi"/>
+    <w:link w:val="Balk1"/>
     <w:uiPriority w:val="1"/>
     <w:rsid w:val="00FE6BAD"/>
     <w:rPr>
@@ -15480,10 +14733,10 @@
       <w:szCs w:val="40"/>
     </w:rPr>
   </w:style>
-  <w:style w:type="character" w:customStyle="1" w:styleId="Heading2Char">
-    <w:name w:val="Heading 2 Char"/>
-    <w:basedOn w:val="DefaultParagraphFont"/>
-    <w:link w:val="Heading2"/>
+  <w:style w:type="character" w:customStyle="1" w:styleId="Balk2Char">
+    <w:name w:val="Başlık 2 Char"/>
+    <w:basedOn w:val="VarsaylanParagrafYazTipi"/>
+    <w:link w:val="Balk2"/>
     <w:uiPriority w:val="9"/>
     <w:rsid w:val="00FE6BAD"/>
     <w:rPr>
@@ -15493,10 +14746,10 @@
       <w:szCs w:val="32"/>
     </w:rPr>
   </w:style>
-  <w:style w:type="character" w:customStyle="1" w:styleId="Heading3Char">
-    <w:name w:val="Heading 3 Char"/>
-    <w:basedOn w:val="DefaultParagraphFont"/>
-    <w:link w:val="Heading3"/>
+  <w:style w:type="character" w:customStyle="1" w:styleId="Balk3Char">
+    <w:name w:val="Başlık 3 Char"/>
+    <w:basedOn w:val="VarsaylanParagrafYazTipi"/>
+    <w:link w:val="Balk3"/>
     <w:uiPriority w:val="9"/>
     <w:rsid w:val="00F139CF"/>
     <w:rPr>
@@ -15506,10 +14759,10 @@
       <w:szCs w:val="28"/>
     </w:rPr>
   </w:style>
-  <w:style w:type="character" w:customStyle="1" w:styleId="Heading4Char">
-    <w:name w:val="Heading 4 Char"/>
-    <w:basedOn w:val="DefaultParagraphFont"/>
-    <w:link w:val="Heading4"/>
+  <w:style w:type="character" w:customStyle="1" w:styleId="Balk4Char">
+    <w:name w:val="Başlık 4 Char"/>
+    <w:basedOn w:val="VarsaylanParagrafYazTipi"/>
+    <w:link w:val="Balk4"/>
     <w:uiPriority w:val="9"/>
     <w:rsid w:val="00330E2A"/>
     <w:rPr>
@@ -15520,10 +14773,10 @@
       <w:sz w:val="28"/>
     </w:rPr>
   </w:style>
-  <w:style w:type="character" w:customStyle="1" w:styleId="Heading5Char">
-    <w:name w:val="Heading 5 Char"/>
-    <w:basedOn w:val="DefaultParagraphFont"/>
-    <w:link w:val="Heading5"/>
+  <w:style w:type="character" w:customStyle="1" w:styleId="Balk5Char">
+    <w:name w:val="Başlık 5 Char"/>
+    <w:basedOn w:val="VarsaylanParagrafYazTipi"/>
+    <w:link w:val="Balk5"/>
     <w:uiPriority w:val="9"/>
     <w:semiHidden/>
     <w:rsid w:val="007F756E"/>
@@ -15532,10 +14785,10 @@
       <w:color w:val="0F4761" w:themeColor="accent1" w:themeShade="BF"/>
     </w:rPr>
   </w:style>
-  <w:style w:type="character" w:customStyle="1" w:styleId="Heading6Char">
-    <w:name w:val="Heading 6 Char"/>
-    <w:basedOn w:val="DefaultParagraphFont"/>
-    <w:link w:val="Heading6"/>
+  <w:style w:type="character" w:customStyle="1" w:styleId="Balk6Char">
+    <w:name w:val="Başlık 6 Char"/>
+    <w:basedOn w:val="VarsaylanParagrafYazTipi"/>
+    <w:link w:val="Balk6"/>
     <w:uiPriority w:val="9"/>
     <w:semiHidden/>
     <w:rsid w:val="007F756E"/>
@@ -15546,10 +14799,10 @@
       <w:color w:val="595959" w:themeColor="text1" w:themeTint="A6"/>
     </w:rPr>
   </w:style>
-  <w:style w:type="character" w:customStyle="1" w:styleId="Heading7Char">
-    <w:name w:val="Heading 7 Char"/>
-    <w:basedOn w:val="DefaultParagraphFont"/>
-    <w:link w:val="Heading7"/>
+  <w:style w:type="character" w:customStyle="1" w:styleId="Balk7Char">
+    <w:name w:val="Başlık 7 Char"/>
+    <w:basedOn w:val="VarsaylanParagrafYazTipi"/>
+    <w:link w:val="Balk7"/>
     <w:uiPriority w:val="9"/>
     <w:semiHidden/>
     <w:rsid w:val="007F756E"/>
@@ -15558,10 +14811,10 @@
       <w:color w:val="595959" w:themeColor="text1" w:themeTint="A6"/>
     </w:rPr>
   </w:style>
-  <w:style w:type="character" w:customStyle="1" w:styleId="Heading8Char">
-    <w:name w:val="Heading 8 Char"/>
-    <w:basedOn w:val="DefaultParagraphFont"/>
-    <w:link w:val="Heading8"/>
+  <w:style w:type="character" w:customStyle="1" w:styleId="Balk8Char">
+    <w:name w:val="Başlık 8 Char"/>
+    <w:basedOn w:val="VarsaylanParagrafYazTipi"/>
+    <w:link w:val="Balk8"/>
     <w:uiPriority w:val="9"/>
     <w:semiHidden/>
     <w:rsid w:val="007F756E"/>
@@ -15572,10 +14825,10 @@
       <w:color w:val="272727" w:themeColor="text1" w:themeTint="D8"/>
     </w:rPr>
   </w:style>
-  <w:style w:type="character" w:customStyle="1" w:styleId="Heading9Char">
-    <w:name w:val="Heading 9 Char"/>
-    <w:basedOn w:val="DefaultParagraphFont"/>
-    <w:link w:val="Heading9"/>
+  <w:style w:type="character" w:customStyle="1" w:styleId="Balk9Char">
+    <w:name w:val="Başlık 9 Char"/>
+    <w:basedOn w:val="VarsaylanParagrafYazTipi"/>
+    <w:link w:val="Balk9"/>
     <w:uiPriority w:val="9"/>
     <w:semiHidden/>
     <w:rsid w:val="007F756E"/>
@@ -15584,11 +14837,11 @@
       <w:color w:val="272727" w:themeColor="text1" w:themeTint="D8"/>
     </w:rPr>
   </w:style>
-  <w:style w:type="paragraph" w:styleId="Title">
+  <w:style w:type="paragraph" w:styleId="KonuBal">
     <w:name w:val="Title"/>
     <w:basedOn w:val="Normal"/>
     <w:next w:val="Normal"/>
-    <w:link w:val="TitleChar"/>
+    <w:link w:val="KonuBalChar"/>
     <w:uiPriority w:val="10"/>
     <w:qFormat/>
     <w:rsid w:val="007F756E"/>
@@ -15604,10 +14857,10 @@
       <w:szCs w:val="56"/>
     </w:rPr>
   </w:style>
-  <w:style w:type="character" w:customStyle="1" w:styleId="TitleChar">
-    <w:name w:val="Title Char"/>
-    <w:basedOn w:val="DefaultParagraphFont"/>
-    <w:link w:val="Title"/>
+  <w:style w:type="character" w:customStyle="1" w:styleId="KonuBalChar">
+    <w:name w:val="Konu Başlığı Char"/>
+    <w:basedOn w:val="VarsaylanParagrafYazTipi"/>
+    <w:link w:val="KonuBal"/>
     <w:uiPriority w:val="10"/>
     <w:rsid w:val="007F756E"/>
     <w:rPr>
@@ -15618,11 +14871,11 @@
       <w:szCs w:val="56"/>
     </w:rPr>
   </w:style>
-  <w:style w:type="paragraph" w:styleId="Subtitle">
+  <w:style w:type="paragraph" w:styleId="Altyaz">
     <w:name w:val="Subtitle"/>
     <w:basedOn w:val="Normal"/>
     <w:next w:val="Normal"/>
-    <w:link w:val="SubtitleChar"/>
+    <w:link w:val="AltyazChar"/>
     <w:uiPriority w:val="11"/>
     <w:qFormat/>
     <w:rsid w:val="007F756E"/>
@@ -15639,10 +14892,10 @@
       <w:szCs w:val="28"/>
     </w:rPr>
   </w:style>
-  <w:style w:type="character" w:customStyle="1" w:styleId="SubtitleChar">
-    <w:name w:val="Subtitle Char"/>
-    <w:basedOn w:val="DefaultParagraphFont"/>
-    <w:link w:val="Subtitle"/>
+  <w:style w:type="character" w:customStyle="1" w:styleId="AltyazChar">
+    <w:name w:val="Altyazı Char"/>
+    <w:basedOn w:val="VarsaylanParagrafYazTipi"/>
+    <w:link w:val="Altyaz"/>
     <w:uiPriority w:val="11"/>
     <w:rsid w:val="007F756E"/>
     <w:rPr>
@@ -15653,11 +14906,11 @@
       <w:szCs w:val="28"/>
     </w:rPr>
   </w:style>
-  <w:style w:type="paragraph" w:styleId="Quote">
+  <w:style w:type="paragraph" w:styleId="Alnt">
     <w:name w:val="Quote"/>
     <w:basedOn w:val="Normal"/>
     <w:next w:val="Normal"/>
-    <w:link w:val="QuoteChar"/>
+    <w:link w:val="AlntChar"/>
     <w:uiPriority w:val="29"/>
     <w:qFormat/>
     <w:rsid w:val="007F756E"/>
@@ -15671,10 +14924,10 @@
       <w:color w:val="404040" w:themeColor="text1" w:themeTint="BF"/>
     </w:rPr>
   </w:style>
-  <w:style w:type="character" w:customStyle="1" w:styleId="QuoteChar">
-    <w:name w:val="Quote Char"/>
-    <w:basedOn w:val="DefaultParagraphFont"/>
-    <w:link w:val="Quote"/>
+  <w:style w:type="character" w:customStyle="1" w:styleId="AlntChar">
+    <w:name w:val="Alıntı Char"/>
+    <w:basedOn w:val="VarsaylanParagrafYazTipi"/>
+    <w:link w:val="Alnt"/>
     <w:uiPriority w:val="29"/>
     <w:rsid w:val="007F756E"/>
     <w:rPr>
@@ -15683,7 +14936,7 @@
       <w:color w:val="404040" w:themeColor="text1" w:themeTint="BF"/>
     </w:rPr>
   </w:style>
-  <w:style w:type="paragraph" w:styleId="ListParagraph">
+  <w:style w:type="paragraph" w:styleId="ListeParagraf">
     <w:name w:val="List Paragraph"/>
     <w:basedOn w:val="Normal"/>
     <w:uiPriority w:val="34"/>
@@ -15694,9 +14947,9 @@
       <w:contextualSpacing/>
     </w:pPr>
   </w:style>
-  <w:style w:type="character" w:styleId="IntenseEmphasis">
+  <w:style w:type="character" w:styleId="GlVurgulama">
     <w:name w:val="Intense Emphasis"/>
-    <w:basedOn w:val="DefaultParagraphFont"/>
+    <w:basedOn w:val="VarsaylanParagrafYazTipi"/>
     <w:uiPriority w:val="21"/>
     <w:qFormat/>
     <w:rsid w:val="007F756E"/>
@@ -15706,11 +14959,11 @@
       <w:color w:val="0F4761" w:themeColor="accent1" w:themeShade="BF"/>
     </w:rPr>
   </w:style>
-  <w:style w:type="paragraph" w:styleId="IntenseQuote">
+  <w:style w:type="paragraph" w:styleId="GlAlnt">
     <w:name w:val="Intense Quote"/>
     <w:basedOn w:val="Normal"/>
     <w:next w:val="Normal"/>
-    <w:link w:val="IntenseQuoteChar"/>
+    <w:link w:val="GlAlntChar"/>
     <w:uiPriority w:val="30"/>
     <w:qFormat/>
     <w:rsid w:val="007F756E"/>
@@ -15729,10 +14982,10 @@
       <w:color w:val="0F4761" w:themeColor="accent1" w:themeShade="BF"/>
     </w:rPr>
   </w:style>
-  <w:style w:type="character" w:customStyle="1" w:styleId="IntenseQuoteChar">
-    <w:name w:val="Intense Quote Char"/>
-    <w:basedOn w:val="DefaultParagraphFont"/>
-    <w:link w:val="IntenseQuote"/>
+  <w:style w:type="character" w:customStyle="1" w:styleId="GlAlntChar">
+    <w:name w:val="Güçlü Alıntı Char"/>
+    <w:basedOn w:val="VarsaylanParagrafYazTipi"/>
+    <w:link w:val="GlAlnt"/>
     <w:uiPriority w:val="30"/>
     <w:rsid w:val="007F756E"/>
     <w:rPr>
@@ -15741,9 +14994,9 @@
       <w:color w:val="0F4761" w:themeColor="accent1" w:themeShade="BF"/>
     </w:rPr>
   </w:style>
-  <w:style w:type="character" w:styleId="IntenseReference">
+  <w:style w:type="character" w:styleId="GlBavuru">
     <w:name w:val="Intense Reference"/>
-    <w:basedOn w:val="DefaultParagraphFont"/>
+    <w:basedOn w:val="VarsaylanParagrafYazTipi"/>
     <w:uiPriority w:val="32"/>
     <w:qFormat/>
     <w:rsid w:val="007F756E"/>
@@ -15755,10 +15008,10 @@
       <w:spacing w:val="5"/>
     </w:rPr>
   </w:style>
-  <w:style w:type="paragraph" w:styleId="Header">
+  <w:style w:type="paragraph" w:styleId="stBilgi">
     <w:name w:val="header"/>
     <w:basedOn w:val="Normal"/>
-    <w:link w:val="HeaderChar"/>
+    <w:link w:val="stBilgiChar"/>
     <w:uiPriority w:val="99"/>
     <w:unhideWhenUsed/>
     <w:rsid w:val="002F01F4"/>
@@ -15770,17 +15023,17 @@
       <w:spacing w:after="0" w:line="240" w:lineRule="auto"/>
     </w:pPr>
   </w:style>
-  <w:style w:type="character" w:customStyle="1" w:styleId="HeaderChar">
-    <w:name w:val="Header Char"/>
-    <w:basedOn w:val="DefaultParagraphFont"/>
-    <w:link w:val="Header"/>
+  <w:style w:type="character" w:customStyle="1" w:styleId="stBilgiChar">
+    <w:name w:val="Üst Bilgi Char"/>
+    <w:basedOn w:val="VarsaylanParagrafYazTipi"/>
+    <w:link w:val="stBilgi"/>
     <w:uiPriority w:val="99"/>
     <w:rsid w:val="002F01F4"/>
   </w:style>
-  <w:style w:type="paragraph" w:styleId="Footer">
+  <w:style w:type="paragraph" w:styleId="AltBilgi">
     <w:name w:val="footer"/>
     <w:basedOn w:val="Normal"/>
-    <w:link w:val="FooterChar"/>
+    <w:link w:val="AltBilgiChar"/>
     <w:uiPriority w:val="99"/>
     <w:unhideWhenUsed/>
     <w:rsid w:val="002F01F4"/>
@@ -15792,16 +15045,16 @@
       <w:spacing w:after="0" w:line="240" w:lineRule="auto"/>
     </w:pPr>
   </w:style>
-  <w:style w:type="character" w:customStyle="1" w:styleId="FooterChar">
-    <w:name w:val="Footer Char"/>
-    <w:basedOn w:val="DefaultParagraphFont"/>
-    <w:link w:val="Footer"/>
+  <w:style w:type="character" w:customStyle="1" w:styleId="AltBilgiChar">
+    <w:name w:val="Alt Bilgi Char"/>
+    <w:basedOn w:val="VarsaylanParagrafYazTipi"/>
+    <w:link w:val="AltBilgi"/>
     <w:uiPriority w:val="99"/>
     <w:rsid w:val="002F01F4"/>
   </w:style>
-  <w:style w:type="table" w:styleId="TableGrid">
+  <w:style w:type="table" w:styleId="TabloKlavuzu">
     <w:name w:val="Table Grid"/>
-    <w:basedOn w:val="TableNormal"/>
+    <w:basedOn w:val="NormalTablo"/>
     <w:uiPriority w:val="39"/>
     <w:rsid w:val="00A82A1D"/>
     <w:pPr>
@@ -15818,9 +15071,9 @@
       </w:tblBorders>
     </w:tblPr>
   </w:style>
-  <w:style w:type="character" w:styleId="Hyperlink">
+  <w:style w:type="character" w:styleId="Kpr">
     <w:name w:val="Hyperlink"/>
-    <w:basedOn w:val="DefaultParagraphFont"/>
+    <w:basedOn w:val="VarsaylanParagrafYazTipi"/>
     <w:uiPriority w:val="99"/>
     <w:unhideWhenUsed/>
     <w:rsid w:val="00FE6BAD"/>
@@ -15829,9 +15082,9 @@
       <w:u w:val="single"/>
     </w:rPr>
   </w:style>
-  <w:style w:type="character" w:styleId="FollowedHyperlink">
+  <w:style w:type="character" w:styleId="zlenenKpr">
     <w:name w:val="FollowedHyperlink"/>
-    <w:basedOn w:val="DefaultParagraphFont"/>
+    <w:basedOn w:val="VarsaylanParagrafYazTipi"/>
     <w:uiPriority w:val="99"/>
     <w:semiHidden/>
     <w:unhideWhenUsed/>
@@ -15877,7 +15130,7 @@
       <w14:ligatures w14:val="none"/>
     </w:rPr>
   </w:style>
-  <w:style w:type="paragraph" w:styleId="TOC1">
+  <w:style w:type="paragraph" w:styleId="T1">
     <w:name w:val="toc 1"/>
     <w:basedOn w:val="Normal"/>
     <w:next w:val="Normal"/>
@@ -15898,7 +15151,7 @@
       <w14:ligatures w14:val="none"/>
     </w:rPr>
   </w:style>
-  <w:style w:type="paragraph" w:styleId="TOC2">
+  <w:style w:type="paragraph" w:styleId="T2">
     <w:name w:val="toc 2"/>
     <w:basedOn w:val="Normal"/>
     <w:next w:val="Normal"/>
@@ -15915,7 +15168,7 @@
       <w14:ligatures w14:val="none"/>
     </w:rPr>
   </w:style>
-  <w:style w:type="paragraph" w:styleId="TOC3">
+  <w:style w:type="paragraph" w:styleId="T3">
     <w:name w:val="toc 3"/>
     <w:basedOn w:val="Normal"/>
     <w:next w:val="Normal"/>
@@ -15937,10 +15190,10 @@
       <w14:ligatures w14:val="none"/>
     </w:rPr>
   </w:style>
-  <w:style w:type="paragraph" w:styleId="CommentText">
+  <w:style w:type="paragraph" w:styleId="AklamaMetni">
     <w:name w:val="annotation text"/>
     <w:basedOn w:val="Normal"/>
-    <w:link w:val="CommentTextChar"/>
+    <w:link w:val="AklamaMetniChar"/>
     <w:uiPriority w:val="99"/>
     <w:semiHidden/>
     <w:unhideWhenUsed/>
@@ -15955,10 +15208,10 @@
       <w14:ligatures w14:val="none"/>
     </w:rPr>
   </w:style>
-  <w:style w:type="character" w:customStyle="1" w:styleId="CommentTextChar">
-    <w:name w:val="Comment Text Char"/>
-    <w:basedOn w:val="DefaultParagraphFont"/>
-    <w:link w:val="CommentText"/>
+  <w:style w:type="character" w:customStyle="1" w:styleId="AklamaMetniChar">
+    <w:name w:val="Açıklama Metni Char"/>
+    <w:basedOn w:val="VarsaylanParagrafYazTipi"/>
+    <w:link w:val="AklamaMetni"/>
     <w:uiPriority w:val="99"/>
     <w:semiHidden/>
     <w:rsid w:val="00FE6BAD"/>
@@ -15969,7 +15222,7 @@
       <w14:ligatures w14:val="none"/>
     </w:rPr>
   </w:style>
-  <w:style w:type="paragraph" w:styleId="Caption">
+  <w:style w:type="paragraph" w:styleId="ResimYazs">
     <w:name w:val="caption"/>
     <w:basedOn w:val="Normal"/>
     <w:next w:val="Normal"/>
@@ -15993,10 +15246,10 @@
       <w14:ligatures w14:val="none"/>
     </w:rPr>
   </w:style>
-  <w:style w:type="paragraph" w:styleId="BodyText">
+  <w:style w:type="paragraph" w:styleId="GvdeMetni">
     <w:name w:val="Body Text"/>
     <w:basedOn w:val="Normal"/>
-    <w:link w:val="BodyTextChar"/>
+    <w:link w:val="GvdeMetniChar"/>
     <w:uiPriority w:val="1"/>
     <w:semiHidden/>
     <w:unhideWhenUsed/>
@@ -16016,10 +15269,10 @@
       <w14:ligatures w14:val="none"/>
     </w:rPr>
   </w:style>
-  <w:style w:type="character" w:customStyle="1" w:styleId="BodyTextChar">
-    <w:name w:val="Body Text Char"/>
-    <w:basedOn w:val="DefaultParagraphFont"/>
-    <w:link w:val="BodyText"/>
+  <w:style w:type="character" w:customStyle="1" w:styleId="GvdeMetniChar">
+    <w:name w:val="Gövde Metni Char"/>
+    <w:basedOn w:val="VarsaylanParagrafYazTipi"/>
+    <w:link w:val="GvdeMetni"/>
     <w:uiPriority w:val="1"/>
     <w:semiHidden/>
     <w:rsid w:val="00FE6BAD"/>
@@ -16032,11 +15285,11 @@
       <w14:ligatures w14:val="none"/>
     </w:rPr>
   </w:style>
-  <w:style w:type="paragraph" w:styleId="CommentSubject">
+  <w:style w:type="paragraph" w:styleId="AklamaKonusu">
     <w:name w:val="annotation subject"/>
-    <w:basedOn w:val="CommentText"/>
-    <w:next w:val="CommentText"/>
-    <w:link w:val="CommentSubjectChar"/>
+    <w:basedOn w:val="AklamaMetni"/>
+    <w:next w:val="AklamaMetni"/>
+    <w:link w:val="AklamaKonusuChar"/>
     <w:uiPriority w:val="99"/>
     <w:semiHidden/>
     <w:unhideWhenUsed/>
@@ -16046,10 +15299,10 @@
       <w:bCs/>
     </w:rPr>
   </w:style>
-  <w:style w:type="character" w:customStyle="1" w:styleId="CommentSubjectChar">
-    <w:name w:val="Comment Subject Char"/>
-    <w:basedOn w:val="CommentTextChar"/>
-    <w:link w:val="CommentSubject"/>
+  <w:style w:type="character" w:customStyle="1" w:styleId="AklamaKonusuChar">
+    <w:name w:val="Açıklama Konusu Char"/>
+    <w:basedOn w:val="AklamaMetniChar"/>
+    <w:link w:val="AklamaKonusu"/>
     <w:uiPriority w:val="99"/>
     <w:semiHidden/>
     <w:rsid w:val="00FE6BAD"/>
@@ -16062,10 +15315,10 @@
       <w14:ligatures w14:val="none"/>
     </w:rPr>
   </w:style>
-  <w:style w:type="paragraph" w:styleId="BalloonText">
+  <w:style w:type="paragraph" w:styleId="BalonMetni">
     <w:name w:val="Balloon Text"/>
     <w:basedOn w:val="Normal"/>
-    <w:link w:val="BalloonTextChar"/>
+    <w:link w:val="BalonMetniChar"/>
     <w:uiPriority w:val="99"/>
     <w:semiHidden/>
     <w:unhideWhenUsed/>
@@ -16081,10 +15334,10 @@
       <w14:ligatures w14:val="none"/>
     </w:rPr>
   </w:style>
-  <w:style w:type="character" w:customStyle="1" w:styleId="BalloonTextChar">
-    <w:name w:val="Balloon Text Char"/>
-    <w:basedOn w:val="DefaultParagraphFont"/>
-    <w:link w:val="BalloonText"/>
+  <w:style w:type="character" w:customStyle="1" w:styleId="BalonMetniChar">
+    <w:name w:val="Balon Metni Char"/>
+    <w:basedOn w:val="VarsaylanParagrafYazTipi"/>
+    <w:link w:val="BalonMetni"/>
     <w:uiPriority w:val="99"/>
     <w:semiHidden/>
     <w:rsid w:val="00FE6BAD"/>
@@ -16096,7 +15349,7 @@
       <w14:ligatures w14:val="none"/>
     </w:rPr>
   </w:style>
-  <w:style w:type="paragraph" w:styleId="Revision">
+  <w:style w:type="paragraph" w:styleId="Dzeltme">
     <w:name w:val="Revision"/>
     <w:uiPriority w:val="99"/>
     <w:semiHidden/>
@@ -16109,9 +15362,9 @@
       <w14:ligatures w14:val="none"/>
     </w:rPr>
   </w:style>
-  <w:style w:type="paragraph" w:styleId="TOCHeading">
+  <w:style w:type="paragraph" w:styleId="TBal">
     <w:name w:val="TOC Heading"/>
-    <w:basedOn w:val="Heading1"/>
+    <w:basedOn w:val="Balk1"/>
     <w:next w:val="Normal"/>
     <w:uiPriority w:val="39"/>
     <w:unhideWhenUsed/>
@@ -16150,7 +15403,7 @@
   </w:style>
   <w:style w:type="character" w:customStyle="1" w:styleId="Style1Char">
     <w:name w:val="Style1 Char"/>
-    <w:basedOn w:val="Heading4Char"/>
+    <w:basedOn w:val="Balk4Char"/>
     <w:link w:val="Style1"/>
     <w:locked/>
     <w:rsid w:val="00FE6BAD"/>
@@ -16169,7 +15422,7 @@
   </w:style>
   <w:style w:type="paragraph" w:customStyle="1" w:styleId="Style1">
     <w:name w:val="Style1"/>
-    <w:basedOn w:val="Heading4"/>
+    <w:basedOn w:val="Balk4"/>
     <w:link w:val="Style1Char"/>
     <w:autoRedefine/>
     <w:qFormat/>
@@ -16191,7 +15444,7 @@
   </w:style>
   <w:style w:type="character" w:customStyle="1" w:styleId="Stil1Char">
     <w:name w:val="Stil1 Char"/>
-    <w:basedOn w:val="DefaultParagraphFont"/>
+    <w:basedOn w:val="VarsaylanParagrafYazTipi"/>
     <w:link w:val="Stil1"/>
     <w:locked/>
     <w:rsid w:val="00FE6BAD"/>
@@ -16206,7 +15459,7 @@
   </w:style>
   <w:style w:type="paragraph" w:customStyle="1" w:styleId="Stil1">
     <w:name w:val="Stil1"/>
-    <w:basedOn w:val="Heading1"/>
+    <w:basedOn w:val="Balk1"/>
     <w:link w:val="Stil1Char"/>
     <w:qFormat/>
     <w:rsid w:val="00FE6BAD"/>
@@ -16221,9 +15474,9 @@
       <w:lang w:eastAsia="tr-TR"/>
     </w:rPr>
   </w:style>
-  <w:style w:type="character" w:styleId="CommentReference">
+  <w:style w:type="character" w:styleId="AklamaBavurusu">
     <w:name w:val="annotation reference"/>
-    <w:basedOn w:val="DefaultParagraphFont"/>
+    <w:basedOn w:val="VarsaylanParagrafYazTipi"/>
     <w:uiPriority w:val="99"/>
     <w:semiHidden/>
     <w:unhideWhenUsed/>
@@ -16233,9 +15486,9 @@
       <w:szCs w:val="16"/>
     </w:rPr>
   </w:style>
-  <w:style w:type="character" w:styleId="PlaceholderText">
+  <w:style w:type="character" w:styleId="YerTutucuMetni">
     <w:name w:val="Placeholder Text"/>
-    <w:basedOn w:val="DefaultParagraphFont"/>
+    <w:basedOn w:val="VarsaylanParagrafYazTipi"/>
     <w:uiPriority w:val="99"/>
     <w:semiHidden/>
     <w:rsid w:val="00FE6BAD"/>
@@ -16245,7 +15498,7 @@
   </w:style>
   <w:style w:type="character" w:customStyle="1" w:styleId="UnresolvedMention1">
     <w:name w:val="Unresolved Mention1"/>
-    <w:basedOn w:val="DefaultParagraphFont"/>
+    <w:basedOn w:val="VarsaylanParagrafYazTipi"/>
     <w:uiPriority w:val="99"/>
     <w:semiHidden/>
     <w:rsid w:val="00FE6BAD"/>
@@ -16256,7 +15509,7 @@
   </w:style>
   <w:style w:type="character" w:customStyle="1" w:styleId="UnresolvedMention2">
     <w:name w:val="Unresolved Mention2"/>
-    <w:basedOn w:val="DefaultParagraphFont"/>
+    <w:basedOn w:val="VarsaylanParagrafYazTipi"/>
     <w:uiPriority w:val="99"/>
     <w:semiHidden/>
     <w:rsid w:val="00FE6BAD"/>
@@ -16267,7 +15520,7 @@
   </w:style>
   <w:style w:type="table" w:customStyle="1" w:styleId="KlavuzuTablo4-Vurgu11">
     <w:name w:val="Kılavuzu Tablo 4 - Vurgu 11"/>
-    <w:basedOn w:val="TableNormal"/>
+    <w:basedOn w:val="NormalTablo"/>
     <w:uiPriority w:val="49"/>
     <w:rsid w:val="00FE6BAD"/>
     <w:pPr>
@@ -16349,9 +15602,9 @@
       </w:tcPr>
     </w:tblStylePr>
   </w:style>
-  <w:style w:type="character" w:styleId="Strong">
+  <w:style w:type="character" w:styleId="Gl">
     <w:name w:val="Strong"/>
-    <w:basedOn w:val="DefaultParagraphFont"/>
+    <w:basedOn w:val="VarsaylanParagrafYazTipi"/>
     <w:uiPriority w:val="22"/>
     <w:qFormat/>
     <w:rsid w:val="00215391"/>

</xml_diff>